<commit_message>
Se arregla errores de permisos, organizacion de dash y logica de bloque en dash
</commit_message>
<xml_diff>
--- a/output/Levantamiento_Preliminar_Inventarios_Salas_Informatica.docx
+++ b/output/Levantamiento_Preliminar_Inventarios_Salas_Informatica.docx
@@ -15344,6 +15344,2307 @@
         </w:rPr>
         <w:t>Fuente revisada: E:\inventario insumos.xlsx</w:t>
       </w:r>
+    </w:p>
+    <w:p>
+      <w:r>
+        <w:br w:type="page"/>
+      </w:r>
+    </w:p>
+    <w:p>
+      <w:pPr>
+        <w:pStyle w:val="Heading1"/>
+        <w:spacing w:before="240" w:after="120"/>
+      </w:pPr>
+      <w:r>
+        <w:rPr>
+          <w:rFonts w:ascii="Aptos" w:hAnsi="Aptos"/>
+          <w:b/>
+          <w:color w:val="000000"/>
+          <w:sz w:val="28"/>
+        </w:rPr>
+        <w:t>Anexo D Decisiones confirmadas para el diseño</w:t>
+      </w:r>
+    </w:p>
+    <w:p>
+      <w:pPr>
+        <w:spacing w:after="140" w:line="269" w:lineRule="auto"/>
+      </w:pPr>
+      <w:r>
+        <w:rPr>
+          <w:rFonts w:ascii="Aptos" w:hAnsi="Aptos"/>
+          <w:b w:val="0"/>
+          <w:color w:val="000000"/>
+          <w:sz w:val="20"/>
+        </w:rPr>
+        <w:t>Este anexo consolida las decisiones funcionales confirmadas durante el levantamiento. Complementa los hallazgos del inventario y convierte las aclaraciones recibidas en reglas de diseño para la ficha central, los formatos institucionales, la identidad de activos, los traslados, los insumos y el control de acceso.</w:t>
+      </w:r>
+    </w:p>
+    <w:p>
+      <w:pPr>
+        <w:pStyle w:val="Heading2"/>
+        <w:spacing w:before="160" w:after="120"/>
+      </w:pPr>
+      <w:r>
+        <w:rPr>
+          <w:rFonts w:ascii="Aptos" w:hAnsi="Aptos"/>
+          <w:b/>
+          <w:color w:val="000000"/>
+          <w:sz w:val="23"/>
+        </w:rPr>
+        <w:t>D.1 Identidad y asociación de activos</w:t>
+      </w:r>
+    </w:p>
+    <w:p>
+      <w:pPr>
+        <w:spacing w:after="140" w:line="269" w:lineRule="auto"/>
+      </w:pPr>
+      <w:r>
+        <w:rPr>
+          <w:rFonts w:ascii="Aptos" w:hAnsi="Aptos"/>
+          <w:b w:val="0"/>
+          <w:color w:val="000000"/>
+          <w:sz w:val="20"/>
+        </w:rPr>
+        <w:t>Cada activo tendrá un identificador interno único y permanente denominado id_activo. Este identificador será la llave técnica del aplicativo, aun cuando la placa institucional o el serial cambien, se corrijan o se repitan entre activos independientes.</w:t>
+      </w:r>
+    </w:p>
+    <w:p>
+      <w:pPr>
+        <w:spacing w:after="140" w:line="269" w:lineRule="auto"/>
+      </w:pPr>
+      <w:r>
+        <w:rPr>
+          <w:rFonts w:ascii="Aptos" w:hAnsi="Aptos"/>
+          <w:b w:val="0"/>
+          <w:color w:val="000000"/>
+          <w:sz w:val="20"/>
+        </w:rPr>
+        <w:t>La placa institucional no tendrá una restricción de unicidad global. Una misma placa puede estar asociada a una CPU y a un monitor independientes. Por ello, una búsqueda por placa deberá mostrar contexto adicional como tipo de activo, serial, ubicación, componente y estado antes de permitir una modificación.</w:t>
+      </w:r>
+    </w:p>
+    <w:tbl>
+      <w:tblPr>
+        <w:tblW w:type="auto" w:w="0"/>
+        <w:jc w:val="center"/>
+        <w:tblLayout w:type="fixed"/>
+        <w:tblLook w:firstColumn="1" w:firstRow="1" w:lastColumn="0" w:lastRow="0" w:noHBand="0" w:noVBand="1" w:val="04A0"/>
+      </w:tblPr>
+      <w:tblGrid>
+        <w:gridCol w:w="3389"/>
+        <w:gridCol w:w="3389"/>
+        <w:gridCol w:w="3389"/>
+      </w:tblGrid>
+      <w:tr>
+        <w:trPr>
+          <w:tblHeader w:val="true"/>
+        </w:trPr>
+        <w:tc>
+          <w:tcPr>
+            <w:tcW w:type="dxa" w:w="2232"/>
+            <w:shd w:fill="1F4E78"/>
+            <w:tcBorders>
+              <w:top w:val="single" w:sz="6" w:color="D9D9D9"/>
+              <w:left w:val="single" w:sz="6" w:color="D9D9D9"/>
+              <w:bottom w:val="single" w:sz="6" w:color="D9D9D9"/>
+              <w:right w:val="single" w:sz="6" w:color="D9D9D9"/>
+              <w:insideH w:val="single" w:sz="6" w:color="D9D9D9"/>
+              <w:insideV w:val="single" w:sz="6" w:color="D9D9D9"/>
+            </w:tcBorders>
+            <w:tcMar>
+              <w:top w:w="90" w:type="dxa"/>
+              <w:start w:w="110" w:type="dxa"/>
+              <w:bottom w:w="90" w:type="dxa"/>
+              <w:end w:w="110" w:type="dxa"/>
+            </w:tcMar>
+            <w:vAlign w:val="center"/>
+          </w:tcPr>
+          <w:p>
+            <w:pPr>
+              <w:jc w:val="center"/>
+            </w:pPr>
+            <w:r>
+              <w:rPr>
+                <w:rFonts w:ascii="Aptos" w:hAnsi="Aptos"/>
+                <w:b/>
+                <w:color w:val="FFFFFF"/>
+                <w:sz w:val="16"/>
+              </w:rPr>
+              <w:t>Situación</w:t>
+            </w:r>
+          </w:p>
+        </w:tc>
+        <w:tc>
+          <w:tcPr>
+            <w:tcW w:type="dxa" w:w="3888"/>
+            <w:shd w:fill="1F4E78"/>
+            <w:tcBorders>
+              <w:top w:val="single" w:sz="6" w:color="D9D9D9"/>
+              <w:left w:val="single" w:sz="6" w:color="D9D9D9"/>
+              <w:bottom w:val="single" w:sz="6" w:color="D9D9D9"/>
+              <w:right w:val="single" w:sz="6" w:color="D9D9D9"/>
+              <w:insideH w:val="single" w:sz="6" w:color="D9D9D9"/>
+              <w:insideV w:val="single" w:sz="6" w:color="D9D9D9"/>
+            </w:tcBorders>
+            <w:tcMar>
+              <w:top w:w="90" w:type="dxa"/>
+              <w:start w:w="110" w:type="dxa"/>
+              <w:bottom w:w="90" w:type="dxa"/>
+              <w:end w:w="110" w:type="dxa"/>
+            </w:tcMar>
+            <w:vAlign w:val="center"/>
+          </w:tcPr>
+          <w:p>
+            <w:pPr>
+              <w:jc w:val="center"/>
+            </w:pPr>
+            <w:r>
+              <w:rPr>
+                <w:rFonts w:ascii="Aptos" w:hAnsi="Aptos"/>
+                <w:b/>
+                <w:color w:val="FFFFFF"/>
+                <w:sz w:val="16"/>
+              </w:rPr>
+              <w:t>Regla confirmada</w:t>
+            </w:r>
+          </w:p>
+        </w:tc>
+        <w:tc>
+          <w:tcPr>
+            <w:tcW w:type="dxa" w:w="4680"/>
+            <w:shd w:fill="1F4E78"/>
+            <w:tcBorders>
+              <w:top w:val="single" w:sz="6" w:color="D9D9D9"/>
+              <w:left w:val="single" w:sz="6" w:color="D9D9D9"/>
+              <w:bottom w:val="single" w:sz="6" w:color="D9D9D9"/>
+              <w:right w:val="single" w:sz="6" w:color="D9D9D9"/>
+              <w:insideH w:val="single" w:sz="6" w:color="D9D9D9"/>
+              <w:insideV w:val="single" w:sz="6" w:color="D9D9D9"/>
+            </w:tcBorders>
+            <w:tcMar>
+              <w:top w:w="90" w:type="dxa"/>
+              <w:start w:w="110" w:type="dxa"/>
+              <w:bottom w:w="90" w:type="dxa"/>
+              <w:end w:w="110" w:type="dxa"/>
+            </w:tcMar>
+            <w:vAlign w:val="center"/>
+          </w:tcPr>
+          <w:p>
+            <w:pPr>
+              <w:jc w:val="center"/>
+            </w:pPr>
+            <w:r>
+              <w:rPr>
+                <w:rFonts w:ascii="Aptos" w:hAnsi="Aptos"/>
+                <w:b/>
+                <w:color w:val="FFFFFF"/>
+                <w:sz w:val="16"/>
+              </w:rPr>
+              <w:t>Comportamiento del aplicativo</w:t>
+            </w:r>
+          </w:p>
+        </w:tc>
+      </w:tr>
+      <w:tr>
+        <w:tc>
+          <w:tcPr>
+            <w:tcW w:type="dxa" w:w="2232"/>
+            <w:tcBorders>
+              <w:top w:val="single" w:sz="6" w:color="D9D9D9"/>
+              <w:left w:val="single" w:sz="6" w:color="D9D9D9"/>
+              <w:bottom w:val="single" w:sz="6" w:color="D9D9D9"/>
+              <w:right w:val="single" w:sz="6" w:color="D9D9D9"/>
+              <w:insideH w:val="single" w:sz="6" w:color="D9D9D9"/>
+              <w:insideV w:val="single" w:sz="6" w:color="D9D9D9"/>
+            </w:tcBorders>
+            <w:tcMar>
+              <w:top w:w="90" w:type="dxa"/>
+              <w:start w:w="110" w:type="dxa"/>
+              <w:bottom w:w="90" w:type="dxa"/>
+              <w:end w:w="110" w:type="dxa"/>
+            </w:tcMar>
+            <w:vAlign w:val="center"/>
+          </w:tcPr>
+          <w:p>
+            <w:pPr>
+              <w:spacing w:after="0" w:line="245" w:lineRule="auto"/>
+            </w:pPr>
+            <w:r>
+              <w:rPr>
+                <w:rFonts w:ascii="Aptos" w:hAnsi="Aptos"/>
+                <w:b w:val="0"/>
+                <w:color w:val="000000"/>
+                <w:sz w:val="16"/>
+              </w:rPr>
+              <w:t>Activo con placa</w:t>
+            </w:r>
+          </w:p>
+        </w:tc>
+        <w:tc>
+          <w:tcPr>
+            <w:tcW w:type="dxa" w:w="3888"/>
+            <w:tcBorders>
+              <w:top w:val="single" w:sz="6" w:color="D9D9D9"/>
+              <w:left w:val="single" w:sz="6" w:color="D9D9D9"/>
+              <w:bottom w:val="single" w:sz="6" w:color="D9D9D9"/>
+              <w:right w:val="single" w:sz="6" w:color="D9D9D9"/>
+              <w:insideH w:val="single" w:sz="6" w:color="D9D9D9"/>
+              <w:insideV w:val="single" w:sz="6" w:color="D9D9D9"/>
+            </w:tcBorders>
+            <w:tcMar>
+              <w:top w:w="90" w:type="dxa"/>
+              <w:start w:w="110" w:type="dxa"/>
+              <w:bottom w:w="90" w:type="dxa"/>
+              <w:end w:w="110" w:type="dxa"/>
+            </w:tcMar>
+            <w:vAlign w:val="center"/>
+          </w:tcPr>
+          <w:p>
+            <w:pPr>
+              <w:spacing w:after="0" w:line="245" w:lineRule="auto"/>
+            </w:pPr>
+            <w:r>
+              <w:rPr>
+                <w:rFonts w:ascii="Aptos" w:hAnsi="Aptos"/>
+                <w:b w:val="0"/>
+                <w:color w:val="000000"/>
+                <w:sz w:val="16"/>
+              </w:rPr>
+              <w:t>La placa se registra como identificador de negocio y puede repetirse.</w:t>
+            </w:r>
+          </w:p>
+        </w:tc>
+        <w:tc>
+          <w:tcPr>
+            <w:tcW w:type="dxa" w:w="4680"/>
+            <w:tcBorders>
+              <w:top w:val="single" w:sz="6" w:color="D9D9D9"/>
+              <w:left w:val="single" w:sz="6" w:color="D9D9D9"/>
+              <w:bottom w:val="single" w:sz="6" w:color="D9D9D9"/>
+              <w:right w:val="single" w:sz="6" w:color="D9D9D9"/>
+              <w:insideH w:val="single" w:sz="6" w:color="D9D9D9"/>
+              <w:insideV w:val="single" w:sz="6" w:color="D9D9D9"/>
+            </w:tcBorders>
+            <w:tcMar>
+              <w:top w:w="90" w:type="dxa"/>
+              <w:start w:w="110" w:type="dxa"/>
+              <w:bottom w:w="90" w:type="dxa"/>
+              <w:end w:w="110" w:type="dxa"/>
+            </w:tcMar>
+            <w:vAlign w:val="center"/>
+          </w:tcPr>
+          <w:p>
+            <w:pPr>
+              <w:spacing w:after="0" w:line="245" w:lineRule="auto"/>
+            </w:pPr>
+            <w:r>
+              <w:rPr>
+                <w:rFonts w:ascii="Aptos" w:hAnsi="Aptos"/>
+                <w:b w:val="0"/>
+                <w:color w:val="000000"/>
+                <w:sz w:val="16"/>
+              </w:rPr>
+              <w:t>Se relaciona con id_activo y se desambigua por tipo, serial y contexto.</w:t>
+            </w:r>
+          </w:p>
+        </w:tc>
+      </w:tr>
+      <w:tr>
+        <w:tc>
+          <w:tcPr>
+            <w:tcW w:type="dxa" w:w="2232"/>
+            <w:shd w:fill="EAF2F8"/>
+            <w:tcBorders>
+              <w:top w:val="single" w:sz="6" w:color="D9D9D9"/>
+              <w:left w:val="single" w:sz="6" w:color="D9D9D9"/>
+              <w:bottom w:val="single" w:sz="6" w:color="D9D9D9"/>
+              <w:right w:val="single" w:sz="6" w:color="D9D9D9"/>
+              <w:insideH w:val="single" w:sz="6" w:color="D9D9D9"/>
+              <w:insideV w:val="single" w:sz="6" w:color="D9D9D9"/>
+            </w:tcBorders>
+            <w:tcMar>
+              <w:top w:w="90" w:type="dxa"/>
+              <w:start w:w="110" w:type="dxa"/>
+              <w:bottom w:w="90" w:type="dxa"/>
+              <w:end w:w="110" w:type="dxa"/>
+            </w:tcMar>
+            <w:vAlign w:val="center"/>
+          </w:tcPr>
+          <w:p>
+            <w:pPr>
+              <w:spacing w:after="0" w:line="245" w:lineRule="auto"/>
+            </w:pPr>
+            <w:r>
+              <w:rPr>
+                <w:rFonts w:ascii="Aptos" w:hAnsi="Aptos"/>
+                <w:b w:val="0"/>
+                <w:color w:val="000000"/>
+                <w:sz w:val="16"/>
+              </w:rPr>
+              <w:t>Activo sin placa y con serial</w:t>
+            </w:r>
+          </w:p>
+        </w:tc>
+        <w:tc>
+          <w:tcPr>
+            <w:tcW w:type="dxa" w:w="3888"/>
+            <w:shd w:fill="EAF2F8"/>
+            <w:tcBorders>
+              <w:top w:val="single" w:sz="6" w:color="D9D9D9"/>
+              <w:left w:val="single" w:sz="6" w:color="D9D9D9"/>
+              <w:bottom w:val="single" w:sz="6" w:color="D9D9D9"/>
+              <w:right w:val="single" w:sz="6" w:color="D9D9D9"/>
+              <w:insideH w:val="single" w:sz="6" w:color="D9D9D9"/>
+              <w:insideV w:val="single" w:sz="6" w:color="D9D9D9"/>
+            </w:tcBorders>
+            <w:tcMar>
+              <w:top w:w="90" w:type="dxa"/>
+              <w:start w:w="110" w:type="dxa"/>
+              <w:bottom w:w="90" w:type="dxa"/>
+              <w:end w:w="110" w:type="dxa"/>
+            </w:tcMar>
+            <w:vAlign w:val="center"/>
+          </w:tcPr>
+          <w:p>
+            <w:pPr>
+              <w:spacing w:after="0" w:line="245" w:lineRule="auto"/>
+            </w:pPr>
+            <w:r>
+              <w:rPr>
+                <w:rFonts w:ascii="Aptos" w:hAnsi="Aptos"/>
+                <w:b w:val="0"/>
+                <w:color w:val="000000"/>
+                <w:sz w:val="16"/>
+              </w:rPr>
+              <w:t>El serial sirve como referencia del componente o proceso.</w:t>
+            </w:r>
+          </w:p>
+        </w:tc>
+        <w:tc>
+          <w:tcPr>
+            <w:tcW w:type="dxa" w:w="4680"/>
+            <w:shd w:fill="EAF2F8"/>
+            <w:tcBorders>
+              <w:top w:val="single" w:sz="6" w:color="D9D9D9"/>
+              <w:left w:val="single" w:sz="6" w:color="D9D9D9"/>
+              <w:bottom w:val="single" w:sz="6" w:color="D9D9D9"/>
+              <w:right w:val="single" w:sz="6" w:color="D9D9D9"/>
+              <w:insideH w:val="single" w:sz="6" w:color="D9D9D9"/>
+              <w:insideV w:val="single" w:sz="6" w:color="D9D9D9"/>
+            </w:tcBorders>
+            <w:tcMar>
+              <w:top w:w="90" w:type="dxa"/>
+              <w:start w:w="110" w:type="dxa"/>
+              <w:bottom w:w="90" w:type="dxa"/>
+              <w:end w:w="110" w:type="dxa"/>
+            </w:tcMar>
+            <w:vAlign w:val="center"/>
+          </w:tcPr>
+          <w:p>
+            <w:pPr>
+              <w:spacing w:after="0" w:line="245" w:lineRule="auto"/>
+            </w:pPr>
+            <w:r>
+              <w:rPr>
+                <w:rFonts w:ascii="Aptos" w:hAnsi="Aptos"/>
+                <w:b w:val="0"/>
+                <w:color w:val="000000"/>
+                <w:sz w:val="16"/>
+              </w:rPr>
+              <w:t>Se registra el serial y se mantiene el id_activo interno.</w:t>
+            </w:r>
+          </w:p>
+        </w:tc>
+      </w:tr>
+      <w:tr>
+        <w:tc>
+          <w:tcPr>
+            <w:tcW w:type="dxa" w:w="2232"/>
+            <w:tcBorders>
+              <w:top w:val="single" w:sz="6" w:color="D9D9D9"/>
+              <w:left w:val="single" w:sz="6" w:color="D9D9D9"/>
+              <w:bottom w:val="single" w:sz="6" w:color="D9D9D9"/>
+              <w:right w:val="single" w:sz="6" w:color="D9D9D9"/>
+              <w:insideH w:val="single" w:sz="6" w:color="D9D9D9"/>
+              <w:insideV w:val="single" w:sz="6" w:color="D9D9D9"/>
+            </w:tcBorders>
+            <w:tcMar>
+              <w:top w:w="90" w:type="dxa"/>
+              <w:start w:w="110" w:type="dxa"/>
+              <w:bottom w:w="90" w:type="dxa"/>
+              <w:end w:w="110" w:type="dxa"/>
+            </w:tcMar>
+            <w:vAlign w:val="center"/>
+          </w:tcPr>
+          <w:p>
+            <w:pPr>
+              <w:spacing w:after="0" w:line="245" w:lineRule="auto"/>
+            </w:pPr>
+            <w:r>
+              <w:rPr>
+                <w:rFonts w:ascii="Aptos" w:hAnsi="Aptos"/>
+                <w:b w:val="0"/>
+                <w:color w:val="000000"/>
+                <w:sz w:val="16"/>
+              </w:rPr>
+              <w:t>Activo sin placa ni serial</w:t>
+            </w:r>
+          </w:p>
+        </w:tc>
+        <w:tc>
+          <w:tcPr>
+            <w:tcW w:type="dxa" w:w="3888"/>
+            <w:tcBorders>
+              <w:top w:val="single" w:sz="6" w:color="D9D9D9"/>
+              <w:left w:val="single" w:sz="6" w:color="D9D9D9"/>
+              <w:bottom w:val="single" w:sz="6" w:color="D9D9D9"/>
+              <w:right w:val="single" w:sz="6" w:color="D9D9D9"/>
+              <w:insideH w:val="single" w:sz="6" w:color="D9D9D9"/>
+              <w:insideV w:val="single" w:sz="6" w:color="D9D9D9"/>
+            </w:tcBorders>
+            <w:tcMar>
+              <w:top w:w="90" w:type="dxa"/>
+              <w:start w:w="110" w:type="dxa"/>
+              <w:bottom w:w="90" w:type="dxa"/>
+              <w:end w:w="110" w:type="dxa"/>
+            </w:tcMar>
+            <w:vAlign w:val="center"/>
+          </w:tcPr>
+          <w:p>
+            <w:pPr>
+              <w:spacing w:after="0" w:line="245" w:lineRule="auto"/>
+            </w:pPr>
+            <w:r>
+              <w:rPr>
+                <w:rFonts w:ascii="Aptos" w:hAnsi="Aptos"/>
+                <w:b w:val="0"/>
+                <w:color w:val="000000"/>
+                <w:sz w:val="16"/>
+              </w:rPr>
+              <w:t>Almacén debe generar un código interno.</w:t>
+            </w:r>
+          </w:p>
+        </w:tc>
+        <w:tc>
+          <w:tcPr>
+            <w:tcW w:type="dxa" w:w="4680"/>
+            <w:tcBorders>
+              <w:top w:val="single" w:sz="6" w:color="D9D9D9"/>
+              <w:left w:val="single" w:sz="6" w:color="D9D9D9"/>
+              <w:bottom w:val="single" w:sz="6" w:color="D9D9D9"/>
+              <w:right w:val="single" w:sz="6" w:color="D9D9D9"/>
+              <w:insideH w:val="single" w:sz="6" w:color="D9D9D9"/>
+              <w:insideV w:val="single" w:sz="6" w:color="D9D9D9"/>
+            </w:tcBorders>
+            <w:tcMar>
+              <w:top w:w="90" w:type="dxa"/>
+              <w:start w:w="110" w:type="dxa"/>
+              <w:bottom w:w="90" w:type="dxa"/>
+              <w:end w:w="110" w:type="dxa"/>
+            </w:tcMar>
+            <w:vAlign w:val="center"/>
+          </w:tcPr>
+          <w:p>
+            <w:pPr>
+              <w:spacing w:after="0" w:line="245" w:lineRule="auto"/>
+            </w:pPr>
+            <w:r>
+              <w:rPr>
+                <w:rFonts w:ascii="Aptos" w:hAnsi="Aptos"/>
+                <w:b w:val="0"/>
+                <w:color w:val="000000"/>
+                <w:sz w:val="16"/>
+              </w:rPr>
+              <w:t>El proceso queda asociado al código interno y al id_activo.</w:t>
+            </w:r>
+          </w:p>
+        </w:tc>
+      </w:tr>
+      <w:tr>
+        <w:tc>
+          <w:tcPr>
+            <w:tcW w:type="dxa" w:w="2232"/>
+            <w:shd w:fill="EAF2F8"/>
+            <w:tcBorders>
+              <w:top w:val="single" w:sz="6" w:color="D9D9D9"/>
+              <w:left w:val="single" w:sz="6" w:color="D9D9D9"/>
+              <w:bottom w:val="single" w:sz="6" w:color="D9D9D9"/>
+              <w:right w:val="single" w:sz="6" w:color="D9D9D9"/>
+              <w:insideH w:val="single" w:sz="6" w:color="D9D9D9"/>
+              <w:insideV w:val="single" w:sz="6" w:color="D9D9D9"/>
+            </w:tcBorders>
+            <w:tcMar>
+              <w:top w:w="90" w:type="dxa"/>
+              <w:start w:w="110" w:type="dxa"/>
+              <w:bottom w:w="90" w:type="dxa"/>
+              <w:end w:w="110" w:type="dxa"/>
+            </w:tcMar>
+            <w:vAlign w:val="center"/>
+          </w:tcPr>
+          <w:p>
+            <w:pPr>
+              <w:spacing w:after="0" w:line="245" w:lineRule="auto"/>
+            </w:pPr>
+            <w:r>
+              <w:rPr>
+                <w:rFonts w:ascii="Aptos" w:hAnsi="Aptos"/>
+                <w:b w:val="0"/>
+                <w:color w:val="000000"/>
+                <w:sz w:val="16"/>
+              </w:rPr>
+              <w:t>CPU y monitor</w:t>
+            </w:r>
+          </w:p>
+        </w:tc>
+        <w:tc>
+          <w:tcPr>
+            <w:tcW w:type="dxa" w:w="3888"/>
+            <w:shd w:fill="EAF2F8"/>
+            <w:tcBorders>
+              <w:top w:val="single" w:sz="6" w:color="D9D9D9"/>
+              <w:left w:val="single" w:sz="6" w:color="D9D9D9"/>
+              <w:bottom w:val="single" w:sz="6" w:color="D9D9D9"/>
+              <w:right w:val="single" w:sz="6" w:color="D9D9D9"/>
+              <w:insideH w:val="single" w:sz="6" w:color="D9D9D9"/>
+              <w:insideV w:val="single" w:sz="6" w:color="D9D9D9"/>
+            </w:tcBorders>
+            <w:tcMar>
+              <w:top w:w="90" w:type="dxa"/>
+              <w:start w:w="110" w:type="dxa"/>
+              <w:bottom w:w="90" w:type="dxa"/>
+              <w:end w:w="110" w:type="dxa"/>
+            </w:tcMar>
+            <w:vAlign w:val="center"/>
+          </w:tcPr>
+          <w:p>
+            <w:pPr>
+              <w:spacing w:after="0" w:line="245" w:lineRule="auto"/>
+            </w:pPr>
+            <w:r>
+              <w:rPr>
+                <w:rFonts w:ascii="Aptos" w:hAnsi="Aptos"/>
+                <w:b w:val="0"/>
+                <w:color w:val="000000"/>
+                <w:sz w:val="16"/>
+              </w:rPr>
+              <w:t>Son activos independientes.</w:t>
+            </w:r>
+          </w:p>
+        </w:tc>
+        <w:tc>
+          <w:tcPr>
+            <w:tcW w:type="dxa" w:w="4680"/>
+            <w:shd w:fill="EAF2F8"/>
+            <w:tcBorders>
+              <w:top w:val="single" w:sz="6" w:color="D9D9D9"/>
+              <w:left w:val="single" w:sz="6" w:color="D9D9D9"/>
+              <w:bottom w:val="single" w:sz="6" w:color="D9D9D9"/>
+              <w:right w:val="single" w:sz="6" w:color="D9D9D9"/>
+              <w:insideH w:val="single" w:sz="6" w:color="D9D9D9"/>
+              <w:insideV w:val="single" w:sz="6" w:color="D9D9D9"/>
+            </w:tcBorders>
+            <w:tcMar>
+              <w:top w:w="90" w:type="dxa"/>
+              <w:start w:w="110" w:type="dxa"/>
+              <w:bottom w:w="90" w:type="dxa"/>
+              <w:end w:w="110" w:type="dxa"/>
+            </w:tcMar>
+            <w:vAlign w:val="center"/>
+          </w:tcPr>
+          <w:p>
+            <w:pPr>
+              <w:spacing w:after="0" w:line="245" w:lineRule="auto"/>
+            </w:pPr>
+            <w:r>
+              <w:rPr>
+                <w:rFonts w:ascii="Aptos" w:hAnsi="Aptos"/>
+                <w:b w:val="0"/>
+                <w:color w:val="000000"/>
+                <w:sz w:val="16"/>
+              </w:rPr>
+              <w:t>Pueden asociarse como componentes de un puesto sin perder su identidad individual.</w:t>
+            </w:r>
+          </w:p>
+        </w:tc>
+      </w:tr>
+    </w:tbl>
+    <w:p>
+      <w:pPr>
+        <w:spacing w:after="40"/>
+      </w:pPr>
+    </w:p>
+    <w:p>
+      <w:pPr>
+        <w:pStyle w:val="Heading2"/>
+        <w:spacing w:before="160" w:after="120"/>
+      </w:pPr>
+      <w:r>
+        <w:rPr>
+          <w:rFonts w:ascii="Aptos" w:hAnsi="Aptos"/>
+          <w:b/>
+          <w:color w:val="000000"/>
+          <w:sz w:val="23"/>
+        </w:rPr>
+        <w:t>D.2 Ficha central y sincronización de formatos</w:t>
+      </w:r>
+    </w:p>
+    <w:p>
+      <w:pPr>
+        <w:spacing w:after="140" w:line="269" w:lineRule="auto"/>
+      </w:pPr>
+      <w:r>
+        <w:rPr>
+          <w:rFonts w:ascii="Aptos" w:hAnsi="Aptos"/>
+          <w:b w:val="0"/>
+          <w:color w:val="000000"/>
+          <w:sz w:val="20"/>
+        </w:rPr>
+        <w:t>La ficha central del activo será la fuente operativa de los datos compartidos. Desde ella se alimentarán simultáneamente la hoja de vida y el formato LAI. El id_activo no sustituirá la placa ni el serial en los formatos; estos conservarán los campos visibles y el diseño institucional vigente.</w:t>
+      </w:r>
+    </w:p>
+    <w:tbl>
+      <w:tblPr>
+        <w:tblW w:type="auto" w:w="0"/>
+        <w:jc w:val="center"/>
+        <w:tblLayout w:type="fixed"/>
+        <w:tblLook w:firstColumn="1" w:firstRow="1" w:lastColumn="0" w:lastRow="0" w:noHBand="0" w:noVBand="1" w:val="04A0"/>
+      </w:tblPr>
+      <w:tblGrid>
+        <w:gridCol w:w="3389"/>
+        <w:gridCol w:w="3389"/>
+        <w:gridCol w:w="3389"/>
+      </w:tblGrid>
+      <w:tr>
+        <w:trPr>
+          <w:tblHeader w:val="true"/>
+        </w:trPr>
+        <w:tc>
+          <w:tcPr>
+            <w:tcW w:type="dxa" w:w="3240"/>
+            <w:shd w:fill="1F4E78"/>
+            <w:tcBorders>
+              <w:top w:val="single" w:sz="6" w:color="D9D9D9"/>
+              <w:left w:val="single" w:sz="6" w:color="D9D9D9"/>
+              <w:bottom w:val="single" w:sz="6" w:color="D9D9D9"/>
+              <w:right w:val="single" w:sz="6" w:color="D9D9D9"/>
+              <w:insideH w:val="single" w:sz="6" w:color="D9D9D9"/>
+              <w:insideV w:val="single" w:sz="6" w:color="D9D9D9"/>
+            </w:tcBorders>
+            <w:tcMar>
+              <w:top w:w="90" w:type="dxa"/>
+              <w:start w:w="110" w:type="dxa"/>
+              <w:bottom w:w="90" w:type="dxa"/>
+              <w:end w:w="110" w:type="dxa"/>
+            </w:tcMar>
+            <w:vAlign w:val="center"/>
+          </w:tcPr>
+          <w:p>
+            <w:pPr>
+              <w:jc w:val="center"/>
+            </w:pPr>
+            <w:r>
+              <w:rPr>
+                <w:rFonts w:ascii="Aptos" w:hAnsi="Aptos"/>
+                <w:b/>
+                <w:color w:val="FFFFFF"/>
+                <w:sz w:val="16"/>
+              </w:rPr>
+              <w:t>Datos compartidos</w:t>
+            </w:r>
+          </w:p>
+        </w:tc>
+        <w:tc>
+          <w:tcPr>
+            <w:tcW w:type="dxa" w:w="3816"/>
+            <w:shd w:fill="1F4E78"/>
+            <w:tcBorders>
+              <w:top w:val="single" w:sz="6" w:color="D9D9D9"/>
+              <w:left w:val="single" w:sz="6" w:color="D9D9D9"/>
+              <w:bottom w:val="single" w:sz="6" w:color="D9D9D9"/>
+              <w:right w:val="single" w:sz="6" w:color="D9D9D9"/>
+              <w:insideH w:val="single" w:sz="6" w:color="D9D9D9"/>
+              <w:insideV w:val="single" w:sz="6" w:color="D9D9D9"/>
+            </w:tcBorders>
+            <w:tcMar>
+              <w:top w:w="90" w:type="dxa"/>
+              <w:start w:w="110" w:type="dxa"/>
+              <w:bottom w:w="90" w:type="dxa"/>
+              <w:end w:w="110" w:type="dxa"/>
+            </w:tcMar>
+            <w:vAlign w:val="center"/>
+          </w:tcPr>
+          <w:p>
+            <w:pPr>
+              <w:jc w:val="center"/>
+            </w:pPr>
+            <w:r>
+              <w:rPr>
+                <w:rFonts w:ascii="Aptos" w:hAnsi="Aptos"/>
+                <w:b/>
+                <w:color w:val="FFFFFF"/>
+                <w:sz w:val="16"/>
+              </w:rPr>
+              <w:t>Hoja de vida</w:t>
+            </w:r>
+          </w:p>
+        </w:tc>
+        <w:tc>
+          <w:tcPr>
+            <w:tcW w:type="dxa" w:w="3744"/>
+            <w:shd w:fill="1F4E78"/>
+            <w:tcBorders>
+              <w:top w:val="single" w:sz="6" w:color="D9D9D9"/>
+              <w:left w:val="single" w:sz="6" w:color="D9D9D9"/>
+              <w:bottom w:val="single" w:sz="6" w:color="D9D9D9"/>
+              <w:right w:val="single" w:sz="6" w:color="D9D9D9"/>
+              <w:insideH w:val="single" w:sz="6" w:color="D9D9D9"/>
+              <w:insideV w:val="single" w:sz="6" w:color="D9D9D9"/>
+            </w:tcBorders>
+            <w:tcMar>
+              <w:top w:w="90" w:type="dxa"/>
+              <w:start w:w="110" w:type="dxa"/>
+              <w:bottom w:w="90" w:type="dxa"/>
+              <w:end w:w="110" w:type="dxa"/>
+            </w:tcMar>
+            <w:vAlign w:val="center"/>
+          </w:tcPr>
+          <w:p>
+            <w:pPr>
+              <w:jc w:val="center"/>
+            </w:pPr>
+            <w:r>
+              <w:rPr>
+                <w:rFonts w:ascii="Aptos" w:hAnsi="Aptos"/>
+                <w:b/>
+                <w:color w:val="FFFFFF"/>
+                <w:sz w:val="16"/>
+              </w:rPr>
+              <w:t>Formato LAI</w:t>
+            </w:r>
+          </w:p>
+        </w:tc>
+      </w:tr>
+      <w:tr>
+        <w:tc>
+          <w:tcPr>
+            <w:tcW w:type="dxa" w:w="3240"/>
+            <w:tcBorders>
+              <w:top w:val="single" w:sz="6" w:color="D9D9D9"/>
+              <w:left w:val="single" w:sz="6" w:color="D9D9D9"/>
+              <w:bottom w:val="single" w:sz="6" w:color="D9D9D9"/>
+              <w:right w:val="single" w:sz="6" w:color="D9D9D9"/>
+              <w:insideH w:val="single" w:sz="6" w:color="D9D9D9"/>
+              <w:insideV w:val="single" w:sz="6" w:color="D9D9D9"/>
+            </w:tcBorders>
+            <w:tcMar>
+              <w:top w:w="90" w:type="dxa"/>
+              <w:start w:w="110" w:type="dxa"/>
+              <w:bottom w:w="90" w:type="dxa"/>
+              <w:end w:w="110" w:type="dxa"/>
+            </w:tcMar>
+            <w:vAlign w:val="center"/>
+          </w:tcPr>
+          <w:p>
+            <w:pPr>
+              <w:spacing w:after="0" w:line="245" w:lineRule="auto"/>
+            </w:pPr>
+            <w:r>
+              <w:rPr>
+                <w:rFonts w:ascii="Aptos" w:hAnsi="Aptos"/>
+                <w:b w:val="0"/>
+                <w:color w:val="000000"/>
+                <w:sz w:val="16"/>
+              </w:rPr>
+              <w:t>Placa, serial, tipo, marca, ubicación, responsable, estado, fecha de revisión y revisor</w:t>
+            </w:r>
+          </w:p>
+        </w:tc>
+        <w:tc>
+          <w:tcPr>
+            <w:tcW w:type="dxa" w:w="3816"/>
+            <w:tcBorders>
+              <w:top w:val="single" w:sz="6" w:color="D9D9D9"/>
+              <w:left w:val="single" w:sz="6" w:color="D9D9D9"/>
+              <w:bottom w:val="single" w:sz="6" w:color="D9D9D9"/>
+              <w:right w:val="single" w:sz="6" w:color="D9D9D9"/>
+              <w:insideH w:val="single" w:sz="6" w:color="D9D9D9"/>
+              <w:insideV w:val="single" w:sz="6" w:color="D9D9D9"/>
+            </w:tcBorders>
+            <w:tcMar>
+              <w:top w:w="90" w:type="dxa"/>
+              <w:start w:w="110" w:type="dxa"/>
+              <w:bottom w:w="90" w:type="dxa"/>
+              <w:end w:w="110" w:type="dxa"/>
+            </w:tcMar>
+            <w:vAlign w:val="center"/>
+          </w:tcPr>
+          <w:p>
+            <w:pPr>
+              <w:spacing w:after="0" w:line="245" w:lineRule="auto"/>
+            </w:pPr>
+            <w:r>
+              <w:rPr>
+                <w:rFonts w:ascii="Aptos" w:hAnsi="Aptos"/>
+                <w:b w:val="0"/>
+                <w:color w:val="000000"/>
+                <w:sz w:val="16"/>
+              </w:rPr>
+              <w:t>Se proyectan en los campos existentes sin modificar la plantilla.</w:t>
+            </w:r>
+          </w:p>
+        </w:tc>
+        <w:tc>
+          <w:tcPr>
+            <w:tcW w:type="dxa" w:w="3744"/>
+            <w:tcBorders>
+              <w:top w:val="single" w:sz="6" w:color="D9D9D9"/>
+              <w:left w:val="single" w:sz="6" w:color="D9D9D9"/>
+              <w:bottom w:val="single" w:sz="6" w:color="D9D9D9"/>
+              <w:right w:val="single" w:sz="6" w:color="D9D9D9"/>
+              <w:insideH w:val="single" w:sz="6" w:color="D9D9D9"/>
+              <w:insideV w:val="single" w:sz="6" w:color="D9D9D9"/>
+            </w:tcBorders>
+            <w:tcMar>
+              <w:top w:w="90" w:type="dxa"/>
+              <w:start w:w="110" w:type="dxa"/>
+              <w:bottom w:w="90" w:type="dxa"/>
+              <w:end w:w="110" w:type="dxa"/>
+            </w:tcMar>
+            <w:vAlign w:val="center"/>
+          </w:tcPr>
+          <w:p>
+            <w:pPr>
+              <w:spacing w:after="0" w:line="245" w:lineRule="auto"/>
+            </w:pPr>
+            <w:r>
+              <w:rPr>
+                <w:rFonts w:ascii="Aptos" w:hAnsi="Aptos"/>
+                <w:b w:val="0"/>
+                <w:color w:val="000000"/>
+                <w:sz w:val="16"/>
+              </w:rPr>
+              <w:t>Se proyectan en los campos de inventario y verificación.</w:t>
+            </w:r>
+          </w:p>
+        </w:tc>
+      </w:tr>
+      <w:tr>
+        <w:tc>
+          <w:tcPr>
+            <w:tcW w:type="dxa" w:w="3240"/>
+            <w:shd w:fill="EAF2F8"/>
+            <w:tcBorders>
+              <w:top w:val="single" w:sz="6" w:color="D9D9D9"/>
+              <w:left w:val="single" w:sz="6" w:color="D9D9D9"/>
+              <w:bottom w:val="single" w:sz="6" w:color="D9D9D9"/>
+              <w:right w:val="single" w:sz="6" w:color="D9D9D9"/>
+              <w:insideH w:val="single" w:sz="6" w:color="D9D9D9"/>
+              <w:insideV w:val="single" w:sz="6" w:color="D9D9D9"/>
+            </w:tcBorders>
+            <w:tcMar>
+              <w:top w:w="90" w:type="dxa"/>
+              <w:start w:w="110" w:type="dxa"/>
+              <w:bottom w:w="90" w:type="dxa"/>
+              <w:end w:w="110" w:type="dxa"/>
+            </w:tcMar>
+            <w:vAlign w:val="center"/>
+          </w:tcPr>
+          <w:p>
+            <w:pPr>
+              <w:spacing w:after="0" w:line="245" w:lineRule="auto"/>
+            </w:pPr>
+            <w:r>
+              <w:rPr>
+                <w:rFonts w:ascii="Aptos" w:hAnsi="Aptos"/>
+                <w:b w:val="0"/>
+                <w:color w:val="000000"/>
+                <w:sz w:val="16"/>
+              </w:rPr>
+              <w:t>Adquisición, proveedor, garantía, especificaciones, accesorios, imagen y mantenimiento</w:t>
+            </w:r>
+          </w:p>
+        </w:tc>
+        <w:tc>
+          <w:tcPr>
+            <w:tcW w:type="dxa" w:w="3816"/>
+            <w:shd w:fill="EAF2F8"/>
+            <w:tcBorders>
+              <w:top w:val="single" w:sz="6" w:color="D9D9D9"/>
+              <w:left w:val="single" w:sz="6" w:color="D9D9D9"/>
+              <w:bottom w:val="single" w:sz="6" w:color="D9D9D9"/>
+              <w:right w:val="single" w:sz="6" w:color="D9D9D9"/>
+              <w:insideH w:val="single" w:sz="6" w:color="D9D9D9"/>
+              <w:insideV w:val="single" w:sz="6" w:color="D9D9D9"/>
+            </w:tcBorders>
+            <w:tcMar>
+              <w:top w:w="90" w:type="dxa"/>
+              <w:start w:w="110" w:type="dxa"/>
+              <w:bottom w:w="90" w:type="dxa"/>
+              <w:end w:w="110" w:type="dxa"/>
+            </w:tcMar>
+            <w:vAlign w:val="center"/>
+          </w:tcPr>
+          <w:p>
+            <w:pPr>
+              <w:spacing w:after="0" w:line="245" w:lineRule="auto"/>
+            </w:pPr>
+            <w:r>
+              <w:rPr>
+                <w:rFonts w:ascii="Aptos" w:hAnsi="Aptos"/>
+                <w:b w:val="0"/>
+                <w:color w:val="000000"/>
+                <w:sz w:val="16"/>
+              </w:rPr>
+              <w:t>Campos propios del formato.</w:t>
+            </w:r>
+          </w:p>
+        </w:tc>
+        <w:tc>
+          <w:tcPr>
+            <w:tcW w:type="dxa" w:w="3744"/>
+            <w:shd w:fill="EAF2F8"/>
+            <w:tcBorders>
+              <w:top w:val="single" w:sz="6" w:color="D9D9D9"/>
+              <w:left w:val="single" w:sz="6" w:color="D9D9D9"/>
+              <w:bottom w:val="single" w:sz="6" w:color="D9D9D9"/>
+              <w:right w:val="single" w:sz="6" w:color="D9D9D9"/>
+              <w:insideH w:val="single" w:sz="6" w:color="D9D9D9"/>
+              <w:insideV w:val="single" w:sz="6" w:color="D9D9D9"/>
+            </w:tcBorders>
+            <w:tcMar>
+              <w:top w:w="90" w:type="dxa"/>
+              <w:start w:w="110" w:type="dxa"/>
+              <w:bottom w:w="90" w:type="dxa"/>
+              <w:end w:w="110" w:type="dxa"/>
+            </w:tcMar>
+            <w:vAlign w:val="center"/>
+          </w:tcPr>
+          <w:p>
+            <w:pPr>
+              <w:spacing w:after="0" w:line="245" w:lineRule="auto"/>
+            </w:pPr>
+            <w:r>
+              <w:rPr>
+                <w:rFonts w:ascii="Aptos" w:hAnsi="Aptos"/>
+                <w:b w:val="0"/>
+                <w:color w:val="000000"/>
+                <w:sz w:val="16"/>
+              </w:rPr>
+              <w:t>No se actualizan automáticamente salvo que sean definidos como compartidos.</w:t>
+            </w:r>
+          </w:p>
+        </w:tc>
+      </w:tr>
+      <w:tr>
+        <w:tc>
+          <w:tcPr>
+            <w:tcW w:type="dxa" w:w="3240"/>
+            <w:tcBorders>
+              <w:top w:val="single" w:sz="6" w:color="D9D9D9"/>
+              <w:left w:val="single" w:sz="6" w:color="D9D9D9"/>
+              <w:bottom w:val="single" w:sz="6" w:color="D9D9D9"/>
+              <w:right w:val="single" w:sz="6" w:color="D9D9D9"/>
+              <w:insideH w:val="single" w:sz="6" w:color="D9D9D9"/>
+              <w:insideV w:val="single" w:sz="6" w:color="D9D9D9"/>
+            </w:tcBorders>
+            <w:tcMar>
+              <w:top w:w="90" w:type="dxa"/>
+              <w:start w:w="110" w:type="dxa"/>
+              <w:bottom w:w="90" w:type="dxa"/>
+              <w:end w:w="110" w:type="dxa"/>
+            </w:tcMar>
+            <w:vAlign w:val="center"/>
+          </w:tcPr>
+          <w:p>
+            <w:pPr>
+              <w:spacing w:after="0" w:line="245" w:lineRule="auto"/>
+            </w:pPr>
+            <w:r>
+              <w:rPr>
+                <w:rFonts w:ascii="Aptos" w:hAnsi="Aptos"/>
+                <w:b w:val="0"/>
+                <w:color w:val="000000"/>
+                <w:sz w:val="16"/>
+              </w:rPr>
+              <w:t>Campaña, resultado físico, ARKA, ERP, revisor y observaciones de levantamiento</w:t>
+            </w:r>
+          </w:p>
+        </w:tc>
+        <w:tc>
+          <w:tcPr>
+            <w:tcW w:type="dxa" w:w="3816"/>
+            <w:tcBorders>
+              <w:top w:val="single" w:sz="6" w:color="D9D9D9"/>
+              <w:left w:val="single" w:sz="6" w:color="D9D9D9"/>
+              <w:bottom w:val="single" w:sz="6" w:color="D9D9D9"/>
+              <w:right w:val="single" w:sz="6" w:color="D9D9D9"/>
+              <w:insideH w:val="single" w:sz="6" w:color="D9D9D9"/>
+              <w:insideV w:val="single" w:sz="6" w:color="D9D9D9"/>
+            </w:tcBorders>
+            <w:tcMar>
+              <w:top w:w="90" w:type="dxa"/>
+              <w:start w:w="110" w:type="dxa"/>
+              <w:bottom w:w="90" w:type="dxa"/>
+              <w:end w:w="110" w:type="dxa"/>
+            </w:tcMar>
+            <w:vAlign w:val="center"/>
+          </w:tcPr>
+          <w:p>
+            <w:pPr>
+              <w:spacing w:after="0" w:line="245" w:lineRule="auto"/>
+            </w:pPr>
+            <w:r>
+              <w:rPr>
+                <w:rFonts w:ascii="Aptos" w:hAnsi="Aptos"/>
+                <w:b w:val="0"/>
+                <w:color w:val="000000"/>
+                <w:sz w:val="16"/>
+              </w:rPr>
+              <w:t>No se actualizan automáticamente.</w:t>
+            </w:r>
+          </w:p>
+        </w:tc>
+        <w:tc>
+          <w:tcPr>
+            <w:tcW w:type="dxa" w:w="3744"/>
+            <w:tcBorders>
+              <w:top w:val="single" w:sz="6" w:color="D9D9D9"/>
+              <w:left w:val="single" w:sz="6" w:color="D9D9D9"/>
+              <w:bottom w:val="single" w:sz="6" w:color="D9D9D9"/>
+              <w:right w:val="single" w:sz="6" w:color="D9D9D9"/>
+              <w:insideH w:val="single" w:sz="6" w:color="D9D9D9"/>
+              <w:insideV w:val="single" w:sz="6" w:color="D9D9D9"/>
+            </w:tcBorders>
+            <w:tcMar>
+              <w:top w:w="90" w:type="dxa"/>
+              <w:start w:w="110" w:type="dxa"/>
+              <w:bottom w:w="90" w:type="dxa"/>
+              <w:end w:w="110" w:type="dxa"/>
+            </w:tcMar>
+            <w:vAlign w:val="center"/>
+          </w:tcPr>
+          <w:p>
+            <w:pPr>
+              <w:spacing w:after="0" w:line="245" w:lineRule="auto"/>
+            </w:pPr>
+            <w:r>
+              <w:rPr>
+                <w:rFonts w:ascii="Aptos" w:hAnsi="Aptos"/>
+                <w:b w:val="0"/>
+                <w:color w:val="000000"/>
+                <w:sz w:val="16"/>
+              </w:rPr>
+              <w:t>Campos propios del formato y de la campaña LAI.</w:t>
+            </w:r>
+          </w:p>
+        </w:tc>
+      </w:tr>
+    </w:tbl>
+    <w:p>
+      <w:pPr>
+        <w:spacing w:after="40"/>
+      </w:pPr>
+    </w:p>
+    <w:p>
+      <w:pPr>
+        <w:spacing w:after="140" w:line="269" w:lineRule="auto"/>
+      </w:pPr>
+      <w:r>
+        <w:rPr>
+          <w:rFonts w:ascii="Aptos" w:hAnsi="Aptos"/>
+          <w:b w:val="0"/>
+          <w:color w:val="000000"/>
+          <w:sz w:val="20"/>
+        </w:rPr>
+        <w:t>Solo los datos declarados compartidos se sincronizarán entre ambos formatos. Un mantenimiento histórico o una observación LAI conservarán su propio contexto y no modificarán por sí solos el otro formato.</w:t>
+      </w:r>
+    </w:p>
+    <w:p>
+      <w:pPr>
+        <w:pStyle w:val="Heading2"/>
+        <w:spacing w:before="160" w:after="120"/>
+      </w:pPr>
+      <w:r>
+        <w:rPr>
+          <w:rFonts w:ascii="Aptos" w:hAnsi="Aptos"/>
+          <w:b/>
+          <w:color w:val="000000"/>
+          <w:sz w:val="23"/>
+        </w:rPr>
+        <w:t>D.3 Fuentes, alcance y conciliación</w:t>
+      </w:r>
+    </w:p>
+    <w:p>
+      <w:pPr>
+        <w:pStyle w:val="ListBullet"/>
+        <w:spacing w:after="60" w:line="259" w:lineRule="auto"/>
+      </w:pPr>
+      <w:r>
+        <w:rPr>
+          <w:rFonts w:ascii="Aptos" w:hAnsi="Aptos"/>
+          <w:b w:val="0"/>
+          <w:color w:val="000000"/>
+          <w:sz w:val="20"/>
+        </w:rPr>
+        <w:t>Los archivos por sala y año se consideran evidencia histórica. Ante diferencias, prevalece el dato con fecha más reciente.</w:t>
+      </w:r>
+    </w:p>
+    <w:p>
+      <w:pPr>
+        <w:pStyle w:val="ListBullet"/>
+        <w:spacing w:after="60" w:line="259" w:lineRule="auto"/>
+      </w:pPr>
+      <w:r>
+        <w:rPr>
+          <w:rFonts w:ascii="Aptos" w:hAnsi="Aptos"/>
+          <w:b w:val="0"/>
+          <w:color w:val="000000"/>
+          <w:sz w:val="20"/>
+        </w:rPr>
+        <w:t>ARKA prevalece como fuente actual durante la transición hacia el nuevo ERP o formato institucional. Las discrepancias son resueltas por el equipo de salas con consulta a almacén.</w:t>
+      </w:r>
+    </w:p>
+    <w:p>
+      <w:pPr>
+        <w:pStyle w:val="ListBullet"/>
+        <w:spacing w:after="60" w:line="259" w:lineRule="auto"/>
+      </w:pPr>
+      <w:r>
+        <w:rPr>
+          <w:rFonts w:ascii="Aptos" w:hAnsi="Aptos"/>
+          <w:b w:val="0"/>
+          <w:color w:val="000000"/>
+          <w:sz w:val="20"/>
+        </w:rPr>
+        <w:t>Almacén y Centro de Acopio representan el mismo contexto logístico. El sistema usará un nombre normalizado y podrá mantener alias para búsquedas y documentos heredados.</w:t>
+      </w:r>
+    </w:p>
+    <w:p>
+      <w:pPr>
+        <w:pStyle w:val="ListBullet"/>
+        <w:spacing w:after="60" w:line="259" w:lineRule="auto"/>
+      </w:pPr>
+      <w:r>
+        <w:rPr>
+          <w:rFonts w:ascii="Aptos" w:hAnsi="Aptos"/>
+          <w:b w:val="0"/>
+          <w:color w:val="000000"/>
+          <w:sz w:val="20"/>
+        </w:rPr>
+        <w:t>Los activos prioritarios son CPU y monitor. También se contemplan teclados, pantallas interactivas, sillas, altavoces, video beam, tabletas y portátiles.</w:t>
+      </w:r>
+    </w:p>
+    <w:p>
+      <w:pPr>
+        <w:pStyle w:val="ListBullet"/>
+        <w:spacing w:after="60" w:line="259" w:lineRule="auto"/>
+      </w:pPr>
+      <w:r>
+        <w:rPr>
+          <w:rFonts w:ascii="Aptos" w:hAnsi="Aptos"/>
+          <w:b w:val="0"/>
+          <w:color w:val="000000"/>
+          <w:sz w:val="20"/>
+        </w:rPr>
+        <w:t>Cables y mouse no requieren placa. Para los demás activos, si no existe placa ni serial, se debe generar un código interno.</w:t>
+      </w:r>
+    </w:p>
+    <w:p>
+      <w:pPr>
+        <w:pStyle w:val="ListBullet"/>
+        <w:spacing w:after="60" w:line="259" w:lineRule="auto"/>
+      </w:pPr>
+      <w:r>
+        <w:rPr>
+          <w:rFonts w:ascii="Aptos" w:hAnsi="Aptos"/>
+          <w:b w:val="0"/>
+          <w:color w:val="000000"/>
+          <w:sz w:val="20"/>
+        </w:rPr>
+        <w:t>La regla de que los activos superiores a 800.000 COP llevan placa debe tratarse como criterio configurable y validarse con almacén antes de automatizarse.</w:t>
+      </w:r>
+    </w:p>
+    <w:p>
+      <w:pPr>
+        <w:pStyle w:val="Heading2"/>
+        <w:spacing w:before="160" w:after="120"/>
+      </w:pPr>
+      <w:r>
+        <w:rPr>
+          <w:rFonts w:ascii="Aptos" w:hAnsi="Aptos"/>
+          <w:b/>
+          <w:color w:val="000000"/>
+          <w:sz w:val="23"/>
+        </w:rPr>
+        <w:t>D.4 Recepción, traslados y trabajadores</w:t>
+      </w:r>
+    </w:p>
+    <w:p>
+      <w:pPr>
+        <w:spacing w:after="140" w:line="269" w:lineRule="auto"/>
+      </w:pPr>
+      <w:r>
+        <w:rPr>
+          <w:rFonts w:ascii="Aptos" w:hAnsi="Aptos"/>
+          <w:b w:val="0"/>
+          <w:color w:val="000000"/>
+          <w:sz w:val="20"/>
+        </w:rPr>
+        <w:t>La recepción técnica es obligatoria para equipos nuevos. Los formatos LAI y hoja de vida se deberán diligenciar por los responsables correspondientes. Los traslados se aplican por cambios de coordinador o casos excepcionales.</w:t>
+      </w:r>
+    </w:p>
+    <w:tbl>
+      <w:tblPr>
+        <w:tblW w:type="auto" w:w="0"/>
+        <w:jc w:val="center"/>
+        <w:tblLayout w:type="fixed"/>
+        <w:tblLook w:firstColumn="1" w:firstRow="1" w:lastColumn="0" w:lastRow="0" w:noHBand="0" w:noVBand="1" w:val="04A0"/>
+      </w:tblPr>
+      <w:tblGrid>
+        <w:gridCol w:w="3389"/>
+        <w:gridCol w:w="3389"/>
+        <w:gridCol w:w="3389"/>
+      </w:tblGrid>
+      <w:tr>
+        <w:trPr>
+          <w:tblHeader w:val="true"/>
+        </w:trPr>
+        <w:tc>
+          <w:tcPr>
+            <w:tcW w:type="dxa" w:w="2015"/>
+            <w:shd w:fill="1F4E78"/>
+            <w:tcBorders>
+              <w:top w:val="single" w:sz="6" w:color="D9D9D9"/>
+              <w:left w:val="single" w:sz="6" w:color="D9D9D9"/>
+              <w:bottom w:val="single" w:sz="6" w:color="D9D9D9"/>
+              <w:right w:val="single" w:sz="6" w:color="D9D9D9"/>
+              <w:insideH w:val="single" w:sz="6" w:color="D9D9D9"/>
+              <w:insideV w:val="single" w:sz="6" w:color="D9D9D9"/>
+            </w:tcBorders>
+            <w:tcMar>
+              <w:top w:w="90" w:type="dxa"/>
+              <w:start w:w="110" w:type="dxa"/>
+              <w:bottom w:w="90" w:type="dxa"/>
+              <w:end w:w="110" w:type="dxa"/>
+            </w:tcMar>
+            <w:vAlign w:val="center"/>
+          </w:tcPr>
+          <w:p>
+            <w:pPr>
+              <w:jc w:val="center"/>
+            </w:pPr>
+            <w:r>
+              <w:rPr>
+                <w:rFonts w:ascii="Aptos" w:hAnsi="Aptos"/>
+                <w:b/>
+                <w:color w:val="FFFFFF"/>
+                <w:sz w:val="16"/>
+              </w:rPr>
+              <w:t>Proceso</w:t>
+            </w:r>
+          </w:p>
+        </w:tc>
+        <w:tc>
+          <w:tcPr>
+            <w:tcW w:type="dxa" w:w="4031"/>
+            <w:shd w:fill="1F4E78"/>
+            <w:tcBorders>
+              <w:top w:val="single" w:sz="6" w:color="D9D9D9"/>
+              <w:left w:val="single" w:sz="6" w:color="D9D9D9"/>
+              <w:bottom w:val="single" w:sz="6" w:color="D9D9D9"/>
+              <w:right w:val="single" w:sz="6" w:color="D9D9D9"/>
+              <w:insideH w:val="single" w:sz="6" w:color="D9D9D9"/>
+              <w:insideV w:val="single" w:sz="6" w:color="D9D9D9"/>
+            </w:tcBorders>
+            <w:tcMar>
+              <w:top w:w="90" w:type="dxa"/>
+              <w:start w:w="110" w:type="dxa"/>
+              <w:bottom w:w="90" w:type="dxa"/>
+              <w:end w:w="110" w:type="dxa"/>
+            </w:tcMar>
+            <w:vAlign w:val="center"/>
+          </w:tcPr>
+          <w:p>
+            <w:pPr>
+              <w:jc w:val="center"/>
+            </w:pPr>
+            <w:r>
+              <w:rPr>
+                <w:rFonts w:ascii="Aptos" w:hAnsi="Aptos"/>
+                <w:b/>
+                <w:color w:val="FFFFFF"/>
+                <w:sz w:val="16"/>
+              </w:rPr>
+              <w:t>Decisión confirmada</w:t>
+            </w:r>
+          </w:p>
+        </w:tc>
+        <w:tc>
+          <w:tcPr>
+            <w:tcW w:type="dxa" w:w="4752"/>
+            <w:shd w:fill="1F4E78"/>
+            <w:tcBorders>
+              <w:top w:val="single" w:sz="6" w:color="D9D9D9"/>
+              <w:left w:val="single" w:sz="6" w:color="D9D9D9"/>
+              <w:bottom w:val="single" w:sz="6" w:color="D9D9D9"/>
+              <w:right w:val="single" w:sz="6" w:color="D9D9D9"/>
+              <w:insideH w:val="single" w:sz="6" w:color="D9D9D9"/>
+              <w:insideV w:val="single" w:sz="6" w:color="D9D9D9"/>
+            </w:tcBorders>
+            <w:tcMar>
+              <w:top w:w="90" w:type="dxa"/>
+              <w:start w:w="110" w:type="dxa"/>
+              <w:bottom w:w="90" w:type="dxa"/>
+              <w:end w:w="110" w:type="dxa"/>
+            </w:tcMar>
+            <w:vAlign w:val="center"/>
+          </w:tcPr>
+          <w:p>
+            <w:pPr>
+              <w:jc w:val="center"/>
+            </w:pPr>
+            <w:r>
+              <w:rPr>
+                <w:rFonts w:ascii="Aptos" w:hAnsi="Aptos"/>
+                <w:b/>
+                <w:color w:val="FFFFFF"/>
+                <w:sz w:val="16"/>
+              </w:rPr>
+              <w:t>Regla de implementación</w:t>
+            </w:r>
+          </w:p>
+        </w:tc>
+      </w:tr>
+      <w:tr>
+        <w:tc>
+          <w:tcPr>
+            <w:tcW w:type="dxa" w:w="2015"/>
+            <w:tcBorders>
+              <w:top w:val="single" w:sz="6" w:color="D9D9D9"/>
+              <w:left w:val="single" w:sz="6" w:color="D9D9D9"/>
+              <w:bottom w:val="single" w:sz="6" w:color="D9D9D9"/>
+              <w:right w:val="single" w:sz="6" w:color="D9D9D9"/>
+              <w:insideH w:val="single" w:sz="6" w:color="D9D9D9"/>
+              <w:insideV w:val="single" w:sz="6" w:color="D9D9D9"/>
+            </w:tcBorders>
+            <w:tcMar>
+              <w:top w:w="90" w:type="dxa"/>
+              <w:start w:w="110" w:type="dxa"/>
+              <w:bottom w:w="90" w:type="dxa"/>
+              <w:end w:w="110" w:type="dxa"/>
+            </w:tcMar>
+            <w:vAlign w:val="center"/>
+          </w:tcPr>
+          <w:p>
+            <w:pPr>
+              <w:spacing w:after="0" w:line="245" w:lineRule="auto"/>
+            </w:pPr>
+            <w:r>
+              <w:rPr>
+                <w:rFonts w:ascii="Aptos" w:hAnsi="Aptos"/>
+                <w:b w:val="0"/>
+                <w:color w:val="000000"/>
+                <w:sz w:val="16"/>
+              </w:rPr>
+              <w:t>Recepción</w:t>
+            </w:r>
+          </w:p>
+        </w:tc>
+        <w:tc>
+          <w:tcPr>
+            <w:tcW w:type="dxa" w:w="4031"/>
+            <w:tcBorders>
+              <w:top w:val="single" w:sz="6" w:color="D9D9D9"/>
+              <w:left w:val="single" w:sz="6" w:color="D9D9D9"/>
+              <w:bottom w:val="single" w:sz="6" w:color="D9D9D9"/>
+              <w:right w:val="single" w:sz="6" w:color="D9D9D9"/>
+              <w:insideH w:val="single" w:sz="6" w:color="D9D9D9"/>
+              <w:insideV w:val="single" w:sz="6" w:color="D9D9D9"/>
+            </w:tcBorders>
+            <w:tcMar>
+              <w:top w:w="90" w:type="dxa"/>
+              <w:start w:w="110" w:type="dxa"/>
+              <w:bottom w:w="90" w:type="dxa"/>
+              <w:end w:w="110" w:type="dxa"/>
+            </w:tcMar>
+            <w:vAlign w:val="center"/>
+          </w:tcPr>
+          <w:p>
+            <w:pPr>
+              <w:spacing w:after="0" w:line="245" w:lineRule="auto"/>
+            </w:pPr>
+            <w:r>
+              <w:rPr>
+                <w:rFonts w:ascii="Aptos" w:hAnsi="Aptos"/>
+                <w:b w:val="0"/>
+                <w:color w:val="000000"/>
+                <w:sz w:val="16"/>
+              </w:rPr>
+              <w:t>LAI y hoja de vida obligatorios para equipo nuevo.</w:t>
+            </w:r>
+          </w:p>
+        </w:tc>
+        <w:tc>
+          <w:tcPr>
+            <w:tcW w:type="dxa" w:w="4752"/>
+            <w:tcBorders>
+              <w:top w:val="single" w:sz="6" w:color="D9D9D9"/>
+              <w:left w:val="single" w:sz="6" w:color="D9D9D9"/>
+              <w:bottom w:val="single" w:sz="6" w:color="D9D9D9"/>
+              <w:right w:val="single" w:sz="6" w:color="D9D9D9"/>
+              <w:insideH w:val="single" w:sz="6" w:color="D9D9D9"/>
+              <w:insideV w:val="single" w:sz="6" w:color="D9D9D9"/>
+            </w:tcBorders>
+            <w:tcMar>
+              <w:top w:w="90" w:type="dxa"/>
+              <w:start w:w="110" w:type="dxa"/>
+              <w:bottom w:w="90" w:type="dxa"/>
+              <w:end w:w="110" w:type="dxa"/>
+            </w:tcMar>
+            <w:vAlign w:val="center"/>
+          </w:tcPr>
+          <w:p>
+            <w:pPr>
+              <w:spacing w:after="0" w:line="245" w:lineRule="auto"/>
+            </w:pPr>
+            <w:r>
+              <w:rPr>
+                <w:rFonts w:ascii="Aptos" w:hAnsi="Aptos"/>
+                <w:b w:val="0"/>
+                <w:color w:val="000000"/>
+                <w:sz w:val="16"/>
+              </w:rPr>
+              <w:t>Crear una recepción que alimente los formatos sin rediseñarlos.</w:t>
+            </w:r>
+          </w:p>
+        </w:tc>
+      </w:tr>
+      <w:tr>
+        <w:tc>
+          <w:tcPr>
+            <w:tcW w:type="dxa" w:w="2015"/>
+            <w:shd w:fill="EAF2F8"/>
+            <w:tcBorders>
+              <w:top w:val="single" w:sz="6" w:color="D9D9D9"/>
+              <w:left w:val="single" w:sz="6" w:color="D9D9D9"/>
+              <w:bottom w:val="single" w:sz="6" w:color="D9D9D9"/>
+              <w:right w:val="single" w:sz="6" w:color="D9D9D9"/>
+              <w:insideH w:val="single" w:sz="6" w:color="D9D9D9"/>
+              <w:insideV w:val="single" w:sz="6" w:color="D9D9D9"/>
+            </w:tcBorders>
+            <w:tcMar>
+              <w:top w:w="90" w:type="dxa"/>
+              <w:start w:w="110" w:type="dxa"/>
+              <w:bottom w:w="90" w:type="dxa"/>
+              <w:end w:w="110" w:type="dxa"/>
+            </w:tcMar>
+            <w:vAlign w:val="center"/>
+          </w:tcPr>
+          <w:p>
+            <w:pPr>
+              <w:spacing w:after="0" w:line="245" w:lineRule="auto"/>
+            </w:pPr>
+            <w:r>
+              <w:rPr>
+                <w:rFonts w:ascii="Aptos" w:hAnsi="Aptos"/>
+                <w:b w:val="0"/>
+                <w:color w:val="000000"/>
+                <w:sz w:val="16"/>
+              </w:rPr>
+              <w:t>Traslado</w:t>
+            </w:r>
+          </w:p>
+        </w:tc>
+        <w:tc>
+          <w:tcPr>
+            <w:tcW w:type="dxa" w:w="4031"/>
+            <w:shd w:fill="EAF2F8"/>
+            <w:tcBorders>
+              <w:top w:val="single" w:sz="6" w:color="D9D9D9"/>
+              <w:left w:val="single" w:sz="6" w:color="D9D9D9"/>
+              <w:bottom w:val="single" w:sz="6" w:color="D9D9D9"/>
+              <w:right w:val="single" w:sz="6" w:color="D9D9D9"/>
+              <w:insideH w:val="single" w:sz="6" w:color="D9D9D9"/>
+              <w:insideV w:val="single" w:sz="6" w:color="D9D9D9"/>
+            </w:tcBorders>
+            <w:tcMar>
+              <w:top w:w="90" w:type="dxa"/>
+              <w:start w:w="110" w:type="dxa"/>
+              <w:bottom w:w="90" w:type="dxa"/>
+              <w:end w:w="110" w:type="dxa"/>
+            </w:tcMar>
+            <w:vAlign w:val="center"/>
+          </w:tcPr>
+          <w:p>
+            <w:pPr>
+              <w:spacing w:after="0" w:line="245" w:lineRule="auto"/>
+            </w:pPr>
+            <w:r>
+              <w:rPr>
+                <w:rFonts w:ascii="Aptos" w:hAnsi="Aptos"/>
+                <w:b w:val="0"/>
+                <w:color w:val="000000"/>
+                <w:sz w:val="16"/>
+              </w:rPr>
+              <w:t>Los responsables pueden variar por caso.</w:t>
+            </w:r>
+          </w:p>
+        </w:tc>
+        <w:tc>
+          <w:tcPr>
+            <w:tcW w:type="dxa" w:w="4752"/>
+            <w:shd w:fill="EAF2F8"/>
+            <w:tcBorders>
+              <w:top w:val="single" w:sz="6" w:color="D9D9D9"/>
+              <w:left w:val="single" w:sz="6" w:color="D9D9D9"/>
+              <w:bottom w:val="single" w:sz="6" w:color="D9D9D9"/>
+              <w:right w:val="single" w:sz="6" w:color="D9D9D9"/>
+              <w:insideH w:val="single" w:sz="6" w:color="D9D9D9"/>
+              <w:insideV w:val="single" w:sz="6" w:color="D9D9D9"/>
+            </w:tcBorders>
+            <w:tcMar>
+              <w:top w:w="90" w:type="dxa"/>
+              <w:start w:w="110" w:type="dxa"/>
+              <w:bottom w:w="90" w:type="dxa"/>
+              <w:end w:w="110" w:type="dxa"/>
+            </w:tcMar>
+            <w:vAlign w:val="center"/>
+          </w:tcPr>
+          <w:p>
+            <w:pPr>
+              <w:spacing w:after="0" w:line="245" w:lineRule="auto"/>
+            </w:pPr>
+            <w:r>
+              <w:rPr>
+                <w:rFonts w:ascii="Aptos" w:hAnsi="Aptos"/>
+                <w:b w:val="0"/>
+                <w:color w:val="000000"/>
+                <w:sz w:val="16"/>
+              </w:rPr>
+              <w:t>Permitir seleccionar o cargar trabajadores y, además, capturar texto libre en los campos del formato.</w:t>
+            </w:r>
+          </w:p>
+        </w:tc>
+      </w:tr>
+      <w:tr>
+        <w:tc>
+          <w:tcPr>
+            <w:tcW w:type="dxa" w:w="2015"/>
+            <w:tcBorders>
+              <w:top w:val="single" w:sz="6" w:color="D9D9D9"/>
+              <w:left w:val="single" w:sz="6" w:color="D9D9D9"/>
+              <w:bottom w:val="single" w:sz="6" w:color="D9D9D9"/>
+              <w:right w:val="single" w:sz="6" w:color="D9D9D9"/>
+              <w:insideH w:val="single" w:sz="6" w:color="D9D9D9"/>
+              <w:insideV w:val="single" w:sz="6" w:color="D9D9D9"/>
+            </w:tcBorders>
+            <w:tcMar>
+              <w:top w:w="90" w:type="dxa"/>
+              <w:start w:w="110" w:type="dxa"/>
+              <w:bottom w:w="90" w:type="dxa"/>
+              <w:end w:w="110" w:type="dxa"/>
+            </w:tcMar>
+            <w:vAlign w:val="center"/>
+          </w:tcPr>
+          <w:p>
+            <w:pPr>
+              <w:spacing w:after="0" w:line="245" w:lineRule="auto"/>
+            </w:pPr>
+            <w:r>
+              <w:rPr>
+                <w:rFonts w:ascii="Aptos" w:hAnsi="Aptos"/>
+                <w:b w:val="0"/>
+                <w:color w:val="000000"/>
+                <w:sz w:val="16"/>
+              </w:rPr>
+              <w:t>Documento emitido</w:t>
+            </w:r>
+          </w:p>
+        </w:tc>
+        <w:tc>
+          <w:tcPr>
+            <w:tcW w:type="dxa" w:w="4031"/>
+            <w:tcBorders>
+              <w:top w:val="single" w:sz="6" w:color="D9D9D9"/>
+              <w:left w:val="single" w:sz="6" w:color="D9D9D9"/>
+              <w:bottom w:val="single" w:sz="6" w:color="D9D9D9"/>
+              <w:right w:val="single" w:sz="6" w:color="D9D9D9"/>
+              <w:insideH w:val="single" w:sz="6" w:color="D9D9D9"/>
+              <w:insideV w:val="single" w:sz="6" w:color="D9D9D9"/>
+            </w:tcBorders>
+            <w:tcMar>
+              <w:top w:w="90" w:type="dxa"/>
+              <w:start w:w="110" w:type="dxa"/>
+              <w:bottom w:w="90" w:type="dxa"/>
+              <w:end w:w="110" w:type="dxa"/>
+            </w:tcMar>
+            <w:vAlign w:val="center"/>
+          </w:tcPr>
+          <w:p>
+            <w:pPr>
+              <w:spacing w:after="0" w:line="245" w:lineRule="auto"/>
+            </w:pPr>
+            <w:r>
+              <w:rPr>
+                <w:rFonts w:ascii="Aptos" w:hAnsi="Aptos"/>
+                <w:b w:val="0"/>
+                <w:color w:val="000000"/>
+                <w:sz w:val="16"/>
+              </w:rPr>
+              <w:t>Debe reflejar los datos variables requeridos por el formato.</w:t>
+            </w:r>
+          </w:p>
+        </w:tc>
+        <w:tc>
+          <w:tcPr>
+            <w:tcW w:type="dxa" w:w="4752"/>
+            <w:tcBorders>
+              <w:top w:val="single" w:sz="6" w:color="D9D9D9"/>
+              <w:left w:val="single" w:sz="6" w:color="D9D9D9"/>
+              <w:bottom w:val="single" w:sz="6" w:color="D9D9D9"/>
+              <w:right w:val="single" w:sz="6" w:color="D9D9D9"/>
+              <w:insideH w:val="single" w:sz="6" w:color="D9D9D9"/>
+              <w:insideV w:val="single" w:sz="6" w:color="D9D9D9"/>
+            </w:tcBorders>
+            <w:tcMar>
+              <w:top w:w="90" w:type="dxa"/>
+              <w:start w:w="110" w:type="dxa"/>
+              <w:bottom w:w="90" w:type="dxa"/>
+              <w:end w:w="110" w:type="dxa"/>
+            </w:tcMar>
+            <w:vAlign w:val="center"/>
+          </w:tcPr>
+          <w:p>
+            <w:pPr>
+              <w:spacing w:after="0" w:line="245" w:lineRule="auto"/>
+            </w:pPr>
+            <w:r>
+              <w:rPr>
+                <w:rFonts w:ascii="Aptos" w:hAnsi="Aptos"/>
+                <w:b w:val="0"/>
+                <w:color w:val="000000"/>
+                <w:sz w:val="16"/>
+              </w:rPr>
+              <w:t>Guardar el texto visible y, cuando aplique, la relación interna con el trabajador.</w:t>
+            </w:r>
+          </w:p>
+        </w:tc>
+      </w:tr>
+      <w:tr>
+        <w:tc>
+          <w:tcPr>
+            <w:tcW w:type="dxa" w:w="2015"/>
+            <w:shd w:fill="EAF2F8"/>
+            <w:tcBorders>
+              <w:top w:val="single" w:sz="6" w:color="D9D9D9"/>
+              <w:left w:val="single" w:sz="6" w:color="D9D9D9"/>
+              <w:bottom w:val="single" w:sz="6" w:color="D9D9D9"/>
+              <w:right w:val="single" w:sz="6" w:color="D9D9D9"/>
+              <w:insideH w:val="single" w:sz="6" w:color="D9D9D9"/>
+              <w:insideV w:val="single" w:sz="6" w:color="D9D9D9"/>
+            </w:tcBorders>
+            <w:tcMar>
+              <w:top w:w="90" w:type="dxa"/>
+              <w:start w:w="110" w:type="dxa"/>
+              <w:bottom w:w="90" w:type="dxa"/>
+              <w:end w:w="110" w:type="dxa"/>
+            </w:tcMar>
+            <w:vAlign w:val="center"/>
+          </w:tcPr>
+          <w:p>
+            <w:pPr>
+              <w:spacing w:after="0" w:line="245" w:lineRule="auto"/>
+            </w:pPr>
+            <w:r>
+              <w:rPr>
+                <w:rFonts w:ascii="Aptos" w:hAnsi="Aptos"/>
+                <w:b w:val="0"/>
+                <w:color w:val="000000"/>
+                <w:sz w:val="16"/>
+              </w:rPr>
+              <w:t>Trabajadores</w:t>
+            </w:r>
+          </w:p>
+        </w:tc>
+        <w:tc>
+          <w:tcPr>
+            <w:tcW w:type="dxa" w:w="4031"/>
+            <w:shd w:fill="EAF2F8"/>
+            <w:tcBorders>
+              <w:top w:val="single" w:sz="6" w:color="D9D9D9"/>
+              <w:left w:val="single" w:sz="6" w:color="D9D9D9"/>
+              <w:bottom w:val="single" w:sz="6" w:color="D9D9D9"/>
+              <w:right w:val="single" w:sz="6" w:color="D9D9D9"/>
+              <w:insideH w:val="single" w:sz="6" w:color="D9D9D9"/>
+              <w:insideV w:val="single" w:sz="6" w:color="D9D9D9"/>
+            </w:tcBorders>
+            <w:tcMar>
+              <w:top w:w="90" w:type="dxa"/>
+              <w:start w:w="110" w:type="dxa"/>
+              <w:bottom w:w="90" w:type="dxa"/>
+              <w:end w:w="110" w:type="dxa"/>
+            </w:tcMar>
+            <w:vAlign w:val="center"/>
+          </w:tcPr>
+          <w:p>
+            <w:pPr>
+              <w:spacing w:after="0" w:line="245" w:lineRule="auto"/>
+            </w:pPr>
+            <w:r>
+              <w:rPr>
+                <w:rFonts w:ascii="Aptos" w:hAnsi="Aptos"/>
+                <w:b w:val="0"/>
+                <w:color w:val="000000"/>
+                <w:sz w:val="16"/>
+              </w:rPr>
+              <w:t>La asignación cambia por semestre.</w:t>
+            </w:r>
+          </w:p>
+        </w:tc>
+        <w:tc>
+          <w:tcPr>
+            <w:tcW w:type="dxa" w:w="4752"/>
+            <w:shd w:fill="EAF2F8"/>
+            <w:tcBorders>
+              <w:top w:val="single" w:sz="6" w:color="D9D9D9"/>
+              <w:left w:val="single" w:sz="6" w:color="D9D9D9"/>
+              <w:bottom w:val="single" w:sz="6" w:color="D9D9D9"/>
+              <w:right w:val="single" w:sz="6" w:color="D9D9D9"/>
+              <w:insideH w:val="single" w:sz="6" w:color="D9D9D9"/>
+              <w:insideV w:val="single" w:sz="6" w:color="D9D9D9"/>
+            </w:tcBorders>
+            <w:tcMar>
+              <w:top w:w="90" w:type="dxa"/>
+              <w:start w:w="110" w:type="dxa"/>
+              <w:bottom w:w="90" w:type="dxa"/>
+              <w:end w:w="110" w:type="dxa"/>
+            </w:tcMar>
+            <w:vAlign w:val="center"/>
+          </w:tcPr>
+          <w:p>
+            <w:pPr>
+              <w:spacing w:after="0" w:line="245" w:lineRule="auto"/>
+            </w:pPr>
+            <w:r>
+              <w:rPr>
+                <w:rFonts w:ascii="Aptos" w:hAnsi="Aptos"/>
+                <w:b w:val="0"/>
+                <w:color w:val="000000"/>
+                <w:sz w:val="16"/>
+              </w:rPr>
+              <w:t>Soportar carga masiva, vigencia, dependencia, cargo, correo y estado.</w:t>
+            </w:r>
+          </w:p>
+        </w:tc>
+      </w:tr>
+    </w:tbl>
+    <w:p>
+      <w:pPr>
+        <w:spacing w:after="40"/>
+      </w:pPr>
+    </w:p>
+    <w:p>
+      <w:pPr>
+        <w:pStyle w:val="Heading2"/>
+        <w:spacing w:before="160" w:after="120"/>
+      </w:pPr>
+      <w:r>
+        <w:rPr>
+          <w:rFonts w:ascii="Aptos" w:hAnsi="Aptos"/>
+          <w:b/>
+          <w:color w:val="000000"/>
+          <w:sz w:val="23"/>
+        </w:rPr>
+        <w:t>D.5 Insumos y acceso</w:t>
+      </w:r>
+    </w:p>
+    <w:p>
+      <w:pPr>
+        <w:spacing w:after="140" w:line="269" w:lineRule="auto"/>
+      </w:pPr>
+      <w:r>
+        <w:rPr>
+          <w:rFonts w:ascii="Aptos" w:hAnsi="Aptos"/>
+          <w:b w:val="0"/>
+          <w:color w:val="000000"/>
+          <w:sz w:val="20"/>
+        </w:rPr>
+        <w:t>El saldo actual validado de insumos será el saldo de apertura de la plataforma. A partir de ese punto, toda actualización deberá quedar como entrada, salida, traslado o ajuste con cantidad numérica, fecha, responsable, motivo y ubicación.</w:t>
+      </w:r>
+    </w:p>
+    <w:p>
+      <w:pPr>
+        <w:spacing w:after="140" w:line="269" w:lineRule="auto"/>
+      </w:pPr>
+      <w:r>
+        <w:rPr>
+          <w:rFonts w:ascii="Aptos" w:hAnsi="Aptos"/>
+          <w:b w:val="0"/>
+          <w:color w:val="000000"/>
+          <w:sz w:val="20"/>
+        </w:rPr>
+        <w:t>Los perfiles asistenciales, técnicos y administradores podrán acceder a información sensible. Los monitores no tendrán acceso a responsables, correos, firmas, facturas ni documentos restringidos.</w:t>
+      </w:r>
+    </w:p>
+    <w:p>
+      <w:pPr>
+        <w:pStyle w:val="Heading2"/>
+        <w:spacing w:before="160" w:after="120"/>
+      </w:pPr>
+      <w:r>
+        <w:rPr>
+          <w:rFonts w:ascii="Aptos" w:hAnsi="Aptos"/>
+          <w:b/>
+          <w:color w:val="000000"/>
+          <w:sz w:val="23"/>
+        </w:rPr>
+        <w:t>D.6 Pendientes vigentes</w:t>
+      </w:r>
+    </w:p>
+    <w:tbl>
+      <w:tblPr>
+        <w:tblW w:type="auto" w:w="0"/>
+        <w:jc w:val="center"/>
+        <w:tblLayout w:type="fixed"/>
+        <w:tblLook w:firstColumn="1" w:firstRow="1" w:lastColumn="0" w:lastRow="0" w:noHBand="0" w:noVBand="1" w:val="04A0"/>
+      </w:tblPr>
+      <w:tblGrid>
+        <w:gridCol w:w="5083"/>
+        <w:gridCol w:w="5083"/>
+      </w:tblGrid>
+      <w:tr>
+        <w:trPr>
+          <w:tblHeader w:val="true"/>
+        </w:trPr>
+        <w:tc>
+          <w:tcPr>
+            <w:tcW w:type="dxa" w:w="2520"/>
+            <w:shd w:fill="1F4E78"/>
+            <w:tcBorders>
+              <w:top w:val="single" w:sz="6" w:color="D9D9D9"/>
+              <w:left w:val="single" w:sz="6" w:color="D9D9D9"/>
+              <w:bottom w:val="single" w:sz="6" w:color="D9D9D9"/>
+              <w:right w:val="single" w:sz="6" w:color="D9D9D9"/>
+              <w:insideH w:val="single" w:sz="6" w:color="D9D9D9"/>
+              <w:insideV w:val="single" w:sz="6" w:color="D9D9D9"/>
+            </w:tcBorders>
+            <w:tcMar>
+              <w:top w:w="90" w:type="dxa"/>
+              <w:start w:w="110" w:type="dxa"/>
+              <w:bottom w:w="90" w:type="dxa"/>
+              <w:end w:w="110" w:type="dxa"/>
+            </w:tcMar>
+            <w:vAlign w:val="center"/>
+          </w:tcPr>
+          <w:p>
+            <w:pPr>
+              <w:jc w:val="center"/>
+            </w:pPr>
+            <w:r>
+              <w:rPr>
+                <w:rFonts w:ascii="Aptos" w:hAnsi="Aptos"/>
+                <w:b/>
+                <w:color w:val="FFFFFF"/>
+                <w:sz w:val="16"/>
+              </w:rPr>
+              <w:t>Tema</w:t>
+            </w:r>
+          </w:p>
+        </w:tc>
+        <w:tc>
+          <w:tcPr>
+            <w:tcW w:type="dxa" w:w="8280"/>
+            <w:shd w:fill="1F4E78"/>
+            <w:tcBorders>
+              <w:top w:val="single" w:sz="6" w:color="D9D9D9"/>
+              <w:left w:val="single" w:sz="6" w:color="D9D9D9"/>
+              <w:bottom w:val="single" w:sz="6" w:color="D9D9D9"/>
+              <w:right w:val="single" w:sz="6" w:color="D9D9D9"/>
+              <w:insideH w:val="single" w:sz="6" w:color="D9D9D9"/>
+              <w:insideV w:val="single" w:sz="6" w:color="D9D9D9"/>
+            </w:tcBorders>
+            <w:tcMar>
+              <w:top w:w="90" w:type="dxa"/>
+              <w:start w:w="110" w:type="dxa"/>
+              <w:bottom w:w="90" w:type="dxa"/>
+              <w:end w:w="110" w:type="dxa"/>
+            </w:tcMar>
+            <w:vAlign w:val="center"/>
+          </w:tcPr>
+          <w:p>
+            <w:pPr>
+              <w:jc w:val="center"/>
+            </w:pPr>
+            <w:r>
+              <w:rPr>
+                <w:rFonts w:ascii="Aptos" w:hAnsi="Aptos"/>
+                <w:b/>
+                <w:color w:val="FFFFFF"/>
+                <w:sz w:val="16"/>
+              </w:rPr>
+              <w:t>Definición pendiente</w:t>
+            </w:r>
+          </w:p>
+        </w:tc>
+      </w:tr>
+      <w:tr>
+        <w:tc>
+          <w:tcPr>
+            <w:tcW w:type="dxa" w:w="2520"/>
+            <w:tcBorders>
+              <w:top w:val="single" w:sz="6" w:color="D9D9D9"/>
+              <w:left w:val="single" w:sz="6" w:color="D9D9D9"/>
+              <w:bottom w:val="single" w:sz="6" w:color="D9D9D9"/>
+              <w:right w:val="single" w:sz="6" w:color="D9D9D9"/>
+              <w:insideH w:val="single" w:sz="6" w:color="D9D9D9"/>
+              <w:insideV w:val="single" w:sz="6" w:color="D9D9D9"/>
+            </w:tcBorders>
+            <w:tcMar>
+              <w:top w:w="90" w:type="dxa"/>
+              <w:start w:w="110" w:type="dxa"/>
+              <w:bottom w:w="90" w:type="dxa"/>
+              <w:end w:w="110" w:type="dxa"/>
+            </w:tcMar>
+            <w:vAlign w:val="center"/>
+          </w:tcPr>
+          <w:p>
+            <w:pPr>
+              <w:spacing w:after="0" w:line="245" w:lineRule="auto"/>
+            </w:pPr>
+            <w:r>
+              <w:rPr>
+                <w:rFonts w:ascii="Aptos" w:hAnsi="Aptos"/>
+                <w:b w:val="0"/>
+                <w:color w:val="000000"/>
+                <w:sz w:val="16"/>
+              </w:rPr>
+              <w:t>Servicio externo y garantías</w:t>
+            </w:r>
+          </w:p>
+        </w:tc>
+        <w:tc>
+          <w:tcPr>
+            <w:tcW w:type="dxa" w:w="8280"/>
+            <w:tcBorders>
+              <w:top w:val="single" w:sz="6" w:color="D9D9D9"/>
+              <w:left w:val="single" w:sz="6" w:color="D9D9D9"/>
+              <w:bottom w:val="single" w:sz="6" w:color="D9D9D9"/>
+              <w:right w:val="single" w:sz="6" w:color="D9D9D9"/>
+              <w:insideH w:val="single" w:sz="6" w:color="D9D9D9"/>
+              <w:insideV w:val="single" w:sz="6" w:color="D9D9D9"/>
+            </w:tcBorders>
+            <w:tcMar>
+              <w:top w:w="90" w:type="dxa"/>
+              <w:start w:w="110" w:type="dxa"/>
+              <w:bottom w:w="90" w:type="dxa"/>
+              <w:end w:w="110" w:type="dxa"/>
+            </w:tcMar>
+            <w:vAlign w:val="center"/>
+          </w:tcPr>
+          <w:p>
+            <w:pPr>
+              <w:spacing w:after="0" w:line="245" w:lineRule="auto"/>
+            </w:pPr>
+            <w:r>
+              <w:rPr>
+                <w:rFonts w:ascii="Aptos" w:hAnsi="Aptos"/>
+                <w:b w:val="0"/>
+                <w:color w:val="000000"/>
+                <w:sz w:val="16"/>
+              </w:rPr>
+              <w:t>Alcance de número de caso, partes utilizadas, tiempos de atención, proveedor responsable, cobertura y cierre técnico.</w:t>
+            </w:r>
+          </w:p>
+        </w:tc>
+      </w:tr>
+      <w:tr>
+        <w:tc>
+          <w:tcPr>
+            <w:tcW w:type="dxa" w:w="2520"/>
+            <w:shd w:fill="EAF2F8"/>
+            <w:tcBorders>
+              <w:top w:val="single" w:sz="6" w:color="D9D9D9"/>
+              <w:left w:val="single" w:sz="6" w:color="D9D9D9"/>
+              <w:bottom w:val="single" w:sz="6" w:color="D9D9D9"/>
+              <w:right w:val="single" w:sz="6" w:color="D9D9D9"/>
+              <w:insideH w:val="single" w:sz="6" w:color="D9D9D9"/>
+              <w:insideV w:val="single" w:sz="6" w:color="D9D9D9"/>
+            </w:tcBorders>
+            <w:tcMar>
+              <w:top w:w="90" w:type="dxa"/>
+              <w:start w:w="110" w:type="dxa"/>
+              <w:bottom w:w="90" w:type="dxa"/>
+              <w:end w:w="110" w:type="dxa"/>
+            </w:tcMar>
+            <w:vAlign w:val="center"/>
+          </w:tcPr>
+          <w:p>
+            <w:pPr>
+              <w:spacing w:after="0" w:line="245" w:lineRule="auto"/>
+            </w:pPr>
+            <w:r>
+              <w:rPr>
+                <w:rFonts w:ascii="Aptos" w:hAnsi="Aptos"/>
+                <w:b w:val="0"/>
+                <w:color w:val="000000"/>
+                <w:sz w:val="16"/>
+              </w:rPr>
+              <w:t>Código interno</w:t>
+            </w:r>
+          </w:p>
+        </w:tc>
+        <w:tc>
+          <w:tcPr>
+            <w:tcW w:type="dxa" w:w="8280"/>
+            <w:shd w:fill="EAF2F8"/>
+            <w:tcBorders>
+              <w:top w:val="single" w:sz="6" w:color="D9D9D9"/>
+              <w:left w:val="single" w:sz="6" w:color="D9D9D9"/>
+              <w:bottom w:val="single" w:sz="6" w:color="D9D9D9"/>
+              <w:right w:val="single" w:sz="6" w:color="D9D9D9"/>
+              <w:insideH w:val="single" w:sz="6" w:color="D9D9D9"/>
+              <w:insideV w:val="single" w:sz="6" w:color="D9D9D9"/>
+            </w:tcBorders>
+            <w:tcMar>
+              <w:top w:w="90" w:type="dxa"/>
+              <w:start w:w="110" w:type="dxa"/>
+              <w:bottom w:w="90" w:type="dxa"/>
+              <w:end w:w="110" w:type="dxa"/>
+            </w:tcMar>
+            <w:vAlign w:val="center"/>
+          </w:tcPr>
+          <w:p>
+            <w:pPr>
+              <w:spacing w:after="0" w:line="245" w:lineRule="auto"/>
+            </w:pPr>
+            <w:r>
+              <w:rPr>
+                <w:rFonts w:ascii="Aptos" w:hAnsi="Aptos"/>
+                <w:b w:val="0"/>
+                <w:color w:val="000000"/>
+                <w:sz w:val="16"/>
+              </w:rPr>
+              <w:t>Procedimiento exacto de solicitud, aprobación y generación por almacén.</w:t>
+            </w:r>
+          </w:p>
+        </w:tc>
+      </w:tr>
+      <w:tr>
+        <w:tc>
+          <w:tcPr>
+            <w:tcW w:type="dxa" w:w="2520"/>
+            <w:tcBorders>
+              <w:top w:val="single" w:sz="6" w:color="D9D9D9"/>
+              <w:left w:val="single" w:sz="6" w:color="D9D9D9"/>
+              <w:bottom w:val="single" w:sz="6" w:color="D9D9D9"/>
+              <w:right w:val="single" w:sz="6" w:color="D9D9D9"/>
+              <w:insideH w:val="single" w:sz="6" w:color="D9D9D9"/>
+              <w:insideV w:val="single" w:sz="6" w:color="D9D9D9"/>
+            </w:tcBorders>
+            <w:tcMar>
+              <w:top w:w="90" w:type="dxa"/>
+              <w:start w:w="110" w:type="dxa"/>
+              <w:bottom w:w="90" w:type="dxa"/>
+              <w:end w:w="110" w:type="dxa"/>
+            </w:tcMar>
+            <w:vAlign w:val="center"/>
+          </w:tcPr>
+          <w:p>
+            <w:pPr>
+              <w:spacing w:after="0" w:line="245" w:lineRule="auto"/>
+            </w:pPr>
+            <w:r>
+              <w:rPr>
+                <w:rFonts w:ascii="Aptos" w:hAnsi="Aptos"/>
+                <w:b w:val="0"/>
+                <w:color w:val="000000"/>
+                <w:sz w:val="16"/>
+              </w:rPr>
+              <w:t>Sincronización</w:t>
+            </w:r>
+          </w:p>
+        </w:tc>
+        <w:tc>
+          <w:tcPr>
+            <w:tcW w:type="dxa" w:w="8280"/>
+            <w:tcBorders>
+              <w:top w:val="single" w:sz="6" w:color="D9D9D9"/>
+              <w:left w:val="single" w:sz="6" w:color="D9D9D9"/>
+              <w:bottom w:val="single" w:sz="6" w:color="D9D9D9"/>
+              <w:right w:val="single" w:sz="6" w:color="D9D9D9"/>
+              <w:insideH w:val="single" w:sz="6" w:color="D9D9D9"/>
+              <w:insideV w:val="single" w:sz="6" w:color="D9D9D9"/>
+            </w:tcBorders>
+            <w:tcMar>
+              <w:top w:w="90" w:type="dxa"/>
+              <w:start w:w="110" w:type="dxa"/>
+              <w:bottom w:w="90" w:type="dxa"/>
+              <w:end w:w="110" w:type="dxa"/>
+            </w:tcMar>
+            <w:vAlign w:val="center"/>
+          </w:tcPr>
+          <w:p>
+            <w:pPr>
+              <w:spacing w:after="0" w:line="245" w:lineRule="auto"/>
+            </w:pPr>
+            <w:r>
+              <w:rPr>
+                <w:rFonts w:ascii="Aptos" w:hAnsi="Aptos"/>
+                <w:b w:val="0"/>
+                <w:color w:val="000000"/>
+                <w:sz w:val="16"/>
+              </w:rPr>
+              <w:t>Lista definitiva de campos compartidos entre LAI y hoja de vida, campos exclusivos y responsables autorizados.</w:t>
+            </w:r>
+          </w:p>
+        </w:tc>
+      </w:tr>
+      <w:tr>
+        <w:tc>
+          <w:tcPr>
+            <w:tcW w:type="dxa" w:w="2520"/>
+            <w:shd w:fill="EAF2F8"/>
+            <w:tcBorders>
+              <w:top w:val="single" w:sz="6" w:color="D9D9D9"/>
+              <w:left w:val="single" w:sz="6" w:color="D9D9D9"/>
+              <w:bottom w:val="single" w:sz="6" w:color="D9D9D9"/>
+              <w:right w:val="single" w:sz="6" w:color="D9D9D9"/>
+              <w:insideH w:val="single" w:sz="6" w:color="D9D9D9"/>
+              <w:insideV w:val="single" w:sz="6" w:color="D9D9D9"/>
+            </w:tcBorders>
+            <w:tcMar>
+              <w:top w:w="90" w:type="dxa"/>
+              <w:start w:w="110" w:type="dxa"/>
+              <w:bottom w:w="90" w:type="dxa"/>
+              <w:end w:w="110" w:type="dxa"/>
+            </w:tcMar>
+            <w:vAlign w:val="center"/>
+          </w:tcPr>
+          <w:p>
+            <w:pPr>
+              <w:spacing w:after="0" w:line="245" w:lineRule="auto"/>
+            </w:pPr>
+            <w:r>
+              <w:rPr>
+                <w:rFonts w:ascii="Aptos" w:hAnsi="Aptos"/>
+                <w:b w:val="0"/>
+                <w:color w:val="000000"/>
+                <w:sz w:val="16"/>
+              </w:rPr>
+              <w:t>Acceso</w:t>
+            </w:r>
+          </w:p>
+        </w:tc>
+        <w:tc>
+          <w:tcPr>
+            <w:tcW w:type="dxa" w:w="8280"/>
+            <w:shd w:fill="EAF2F8"/>
+            <w:tcBorders>
+              <w:top w:val="single" w:sz="6" w:color="D9D9D9"/>
+              <w:left w:val="single" w:sz="6" w:color="D9D9D9"/>
+              <w:bottom w:val="single" w:sz="6" w:color="D9D9D9"/>
+              <w:right w:val="single" w:sz="6" w:color="D9D9D9"/>
+              <w:insideH w:val="single" w:sz="6" w:color="D9D9D9"/>
+              <w:insideV w:val="single" w:sz="6" w:color="D9D9D9"/>
+            </w:tcBorders>
+            <w:tcMar>
+              <w:top w:w="90" w:type="dxa"/>
+              <w:start w:w="110" w:type="dxa"/>
+              <w:bottom w:w="90" w:type="dxa"/>
+              <w:end w:w="110" w:type="dxa"/>
+            </w:tcMar>
+            <w:vAlign w:val="center"/>
+          </w:tcPr>
+          <w:p>
+            <w:pPr>
+              <w:spacing w:after="0" w:line="245" w:lineRule="auto"/>
+            </w:pPr>
+            <w:r>
+              <w:rPr>
+                <w:rFonts w:ascii="Aptos" w:hAnsi="Aptos"/>
+                <w:b w:val="0"/>
+                <w:color w:val="000000"/>
+                <w:sz w:val="16"/>
+              </w:rPr>
+              <w:t>Nivel de detalle de permisos por perfil sobre formatos emitidos, anexos, firmas y datos personales.</w:t>
+            </w:r>
+          </w:p>
+        </w:tc>
+      </w:tr>
+      <w:tr>
+        <w:tc>
+          <w:tcPr>
+            <w:tcW w:type="dxa" w:w="2520"/>
+            <w:tcBorders>
+              <w:top w:val="single" w:sz="6" w:color="D9D9D9"/>
+              <w:left w:val="single" w:sz="6" w:color="D9D9D9"/>
+              <w:bottom w:val="single" w:sz="6" w:color="D9D9D9"/>
+              <w:right w:val="single" w:sz="6" w:color="D9D9D9"/>
+              <w:insideH w:val="single" w:sz="6" w:color="D9D9D9"/>
+              <w:insideV w:val="single" w:sz="6" w:color="D9D9D9"/>
+            </w:tcBorders>
+            <w:tcMar>
+              <w:top w:w="90" w:type="dxa"/>
+              <w:start w:w="110" w:type="dxa"/>
+              <w:bottom w:w="90" w:type="dxa"/>
+              <w:end w:w="110" w:type="dxa"/>
+            </w:tcMar>
+            <w:vAlign w:val="center"/>
+          </w:tcPr>
+          <w:p>
+            <w:pPr>
+              <w:spacing w:after="0" w:line="245" w:lineRule="auto"/>
+            </w:pPr>
+            <w:r>
+              <w:rPr>
+                <w:rFonts w:ascii="Aptos" w:hAnsi="Aptos"/>
+                <w:b w:val="0"/>
+                <w:color w:val="000000"/>
+                <w:sz w:val="16"/>
+              </w:rPr>
+              <w:t>Configuración técnica</w:t>
+            </w:r>
+          </w:p>
+        </w:tc>
+        <w:tc>
+          <w:tcPr>
+            <w:tcW w:type="dxa" w:w="8280"/>
+            <w:tcBorders>
+              <w:top w:val="single" w:sz="6" w:color="D9D9D9"/>
+              <w:left w:val="single" w:sz="6" w:color="D9D9D9"/>
+              <w:bottom w:val="single" w:sz="6" w:color="D9D9D9"/>
+              <w:right w:val="single" w:sz="6" w:color="D9D9D9"/>
+              <w:insideH w:val="single" w:sz="6" w:color="D9D9D9"/>
+              <w:insideV w:val="single" w:sz="6" w:color="D9D9D9"/>
+            </w:tcBorders>
+            <w:tcMar>
+              <w:top w:w="90" w:type="dxa"/>
+              <w:start w:w="110" w:type="dxa"/>
+              <w:bottom w:w="90" w:type="dxa"/>
+              <w:end w:w="110" w:type="dxa"/>
+            </w:tcMar>
+            <w:vAlign w:val="center"/>
+          </w:tcPr>
+          <w:p>
+            <w:pPr>
+              <w:spacing w:after="0" w:line="245" w:lineRule="auto"/>
+            </w:pPr>
+            <w:r>
+              <w:rPr>
+                <w:rFonts w:ascii="Aptos" w:hAnsi="Aptos"/>
+                <w:b w:val="0"/>
+                <w:color w:val="000000"/>
+                <w:sz w:val="16"/>
+              </w:rPr>
+              <w:t>Decidir si imágenes de disco, respaldos y software instalado forman parte del aplicativo.</w:t>
+            </w:r>
+          </w:p>
+        </w:tc>
+      </w:tr>
+    </w:tbl>
+    <w:p>
+      <w:pPr>
+        <w:spacing w:after="40"/>
+      </w:pPr>
     </w:p>
     <w:sectPr>
       <w:footerReference w:type="default" r:id="rId9"/>

</xml_diff>

<commit_message>
Se arreglo parte de credenciales, software instalado y limpieza
</commit_message>
<xml_diff>
--- a/output/Levantamiento_Preliminar_Inventarios_Salas_Informatica.docx
+++ b/output/Levantamiento_Preliminar_Inventarios_Salas_Informatica.docx
@@ -16,7 +16,7 @@
           <w:color w:val="000000"/>
           <w:sz w:val="48"/>
         </w:rPr>
-        <w:t>Levantamiento preliminar de requerimientos</w:t>
+        <w:t>Información preliminar para los macroprocesos del aplicativo</w:t>
       </w:r>
     </w:p>
     <w:p>
@@ -489,7 +489,7 @@
           <w:color w:val="000000"/>
           <w:sz w:val="20"/>
         </w:rPr>
-        <w:t>La evidencia demuestra que el archivo XLSM es la fuente de análisis adecuada, mientras que las exportaciones CSV no deben usarse como fuente maestra. Los CSV convierten numerosos códigos largos a notación científica y no preservan imágenes, fórmulas, celdas combinadas, configuración de impresión ni macros.</w:t>
+        <w:t>La evidencia demuestra que el archivo XLSM es la fuente de an�lisis adecuada, porque conserva la estructura del libro, las im�genes, las f�rmulas, las celdas combinadas, la configuraci�n de impresi�n y los componentes necesarios para comprender el proceso actual.</w:t>
       </w:r>
     </w:p>
     <w:p>
@@ -15405,7 +15405,7 @@
           <w:color w:val="000000"/>
           <w:sz w:val="20"/>
         </w:rPr>
-        <w:t>Cada activo tendrá un identificador interno único y permanente denominado id_activo. Este identificador será la llave técnica del aplicativo, aun cuando la placa institucional o el serial cambien, se corrijan o se repitan entre activos independientes.</w:t>
+        <w:t>Los activos se identifican en las fuentes mediante placas institucionales, n�meros de serie, c�digos de inventario y otros campos descriptivos. La relaci�n entre estos identificadores debe conservarse en los formatos institucionales y validarse durante la conciliaci�n.</w:t>
       </w:r>
     </w:p>
     <w:p>
@@ -15643,7 +15643,7 @@
                 <w:color w:val="000000"/>
                 <w:sz w:val="16"/>
               </w:rPr>
-              <w:t>Se relaciona con id_activo y se desambigua por tipo, serial y contexto.</w:t>
+              <w:t>Se desambigua por tipo, serial, placa y contexto.</w:t>
             </w:r>
           </w:p>
         </w:tc>
@@ -15750,7 +15750,7 @@
                 <w:color w:val="000000"/>
                 <w:sz w:val="16"/>
               </w:rPr>
-              <w:t>Se registra el serial y se mantiene el id_activo interno.</w:t>
+              <w:t>Se registra el serial como referencia del componente o proceso.</w:t>
             </w:r>
           </w:p>
         </w:tc>
@@ -15854,7 +15854,7 @@
                 <w:color w:val="000000"/>
                 <w:sz w:val="16"/>
               </w:rPr>
-              <w:t>El proceso queda asociado al código interno y al id_activo.</w:t>
+              <w:t>El proceso queda asociado al c�digo interno cuando este haya sido generado por almac�n.</w:t>
             </w:r>
           </w:p>
         </w:tc>
@@ -15998,7 +15998,7 @@
           <w:color w:val="000000"/>
           <w:sz w:val="20"/>
         </w:rPr>
-        <w:t>La ficha central del activo será la fuente operativa de los datos compartidos. Desde ella se alimentarán simultáneamente la hoja de vida y el formato LAI. El id_activo no sustituirá la placa ni el serial en los formatos; estos conservarán los campos visibles y el diseño institucional vigente.</w:t>
+        <w:t>La ficha central del activo ser� la fuente operativa de los datos compartidos. Desde ella se alimentar�n simult�neamente la hoja de vida y el formato LAI. La ficha no sustituir� la placa ni el serial en los formatos; estos conservar�n los campos visibles y el dise�o institucional vigente.</w:t>
       </w:r>
     </w:p>
     <w:tbl>

</xml_diff>